<commit_message>
DataAnalysis: passed lw4, lw5
</commit_message>
<xml_diff>
--- a/Data Analysis/LW4/Кадарметов_ЛР4.docx
+++ b/Data Analysis/LW4/Кадарметов_ЛР4.docx
@@ -1,6 +1,6 @@
 
 <file path=word/document.xml><?xml version="1.0" encoding="utf-8"?>
-<w:document xmlns:wpc="http://schemas.microsoft.com/office/word/2010/wordprocessingCanvas" xmlns:cx="http://schemas.microsoft.com/office/drawing/2014/chartex" xmlns:cx1="http://schemas.microsoft.com/office/drawing/2015/9/8/chartex" xmlns:cx2="http://schemas.microsoft.com/office/drawing/2015/10/21/chartex" xmlns:cx3="http://schemas.microsoft.com/office/drawing/2016/5/9/chartex" xmlns:cx4="http://schemas.microsoft.com/office/drawing/2016/5/10/chartex" xmlns:cx5="http://schemas.microsoft.com/office/drawing/2016/5/11/chartex" xmlns:cx6="http://schemas.microsoft.com/office/drawing/2016/5/12/chartex" xmlns:cx7="http://schemas.microsoft.com/office/drawing/2016/5/13/chartex" xmlns:cx8="http://schemas.microsoft.com/office/drawing/2016/5/14/chartex" xmlns:mc="http://schemas.openxmlformats.org/markup-compatibility/2006" xmlns:aink="http://schemas.microsoft.com/office/drawing/2016/ink" xmlns:am3d="http://schemas.microsoft.com/office/drawing/2017/model3d" xmlns:o="urn:schemas-microsoft-com:office:office" xmlns:r="http://schemas.openxmlformats.org/officeDocument/2006/relationships" xmlns:m="http://schemas.openxmlformats.org/officeDocument/2006/math" xmlns:v="urn:schemas-microsoft-com:vml" xmlns:wp14="http://schemas.microsoft.com/office/word/2010/wordprocessingDrawing" xmlns:wp="http://schemas.openxmlformats.org/drawingml/2006/wordprocessingDrawing" xmlns:w10="urn:schemas-microsoft-com:office:word" xmlns:w="http://schemas.openxmlformats.org/wordprocessingml/2006/main" xmlns:w14="http://schemas.microsoft.com/office/word/2010/wordml" xmlns:w15="http://schemas.microsoft.com/office/word/2012/wordml" xmlns:w16cex="http://schemas.microsoft.com/office/word/2018/wordml/cex" xmlns:w16cid="http://schemas.microsoft.com/office/word/2016/wordml/cid" xmlns:w16="http://schemas.microsoft.com/office/word/2018/wordml" xmlns:w16sdtdh="http://schemas.microsoft.com/office/word/2020/wordml/sdtdatahash" xmlns:w16se="http://schemas.microsoft.com/office/word/2015/wordml/symex" xmlns:wpg="http://schemas.microsoft.com/office/word/2010/wordprocessingGroup" xmlns:wpi="http://schemas.microsoft.com/office/word/2010/wordprocessingInk" xmlns:wne="http://schemas.microsoft.com/office/word/2006/wordml" xmlns:wps="http://schemas.microsoft.com/office/word/2010/wordprocessingShape" mc:Ignorable="w14 w15 w16se w16cid w16 w16cex w16sdtdh wp14">
+<w:document xmlns:wpc="http://schemas.microsoft.com/office/word/2010/wordprocessingCanvas" xmlns:cx="http://schemas.microsoft.com/office/drawing/2014/chartex" xmlns:cx1="http://schemas.microsoft.com/office/drawing/2015/9/8/chartex" xmlns:cx2="http://schemas.microsoft.com/office/drawing/2015/10/21/chartex" xmlns:cx3="http://schemas.microsoft.com/office/drawing/2016/5/9/chartex" xmlns:cx4="http://schemas.microsoft.com/office/drawing/2016/5/10/chartex" xmlns:cx5="http://schemas.microsoft.com/office/drawing/2016/5/11/chartex" xmlns:cx6="http://schemas.microsoft.com/office/drawing/2016/5/12/chartex" xmlns:cx7="http://schemas.microsoft.com/office/drawing/2016/5/13/chartex" xmlns:cx8="http://schemas.microsoft.com/office/drawing/2016/5/14/chartex" xmlns:mc="http://schemas.openxmlformats.org/markup-compatibility/2006" xmlns:aink="http://schemas.microsoft.com/office/drawing/2016/ink" xmlns:am3d="http://schemas.microsoft.com/office/drawing/2017/model3d" xmlns:o="urn:schemas-microsoft-com:office:office" xmlns:oel="http://schemas.microsoft.com/office/2019/extlst" xmlns:r="http://schemas.openxmlformats.org/officeDocument/2006/relationships" xmlns:m="http://schemas.openxmlformats.org/officeDocument/2006/math" xmlns:v="urn:schemas-microsoft-com:vml" xmlns:wp14="http://schemas.microsoft.com/office/word/2010/wordprocessingDrawing" xmlns:wp="http://schemas.openxmlformats.org/drawingml/2006/wordprocessingDrawing" xmlns:w10="urn:schemas-microsoft-com:office:word" xmlns:w="http://schemas.openxmlformats.org/wordprocessingml/2006/main" xmlns:w14="http://schemas.microsoft.com/office/word/2010/wordml" xmlns:w15="http://schemas.microsoft.com/office/word/2012/wordml" xmlns:w16cex="http://schemas.microsoft.com/office/word/2018/wordml/cex" xmlns:w16cid="http://schemas.microsoft.com/office/word/2016/wordml/cid" xmlns:w16="http://schemas.microsoft.com/office/word/2018/wordml" xmlns:w16du="http://schemas.microsoft.com/office/word/2023/wordml/word16du" xmlns:w16sdtdh="http://schemas.microsoft.com/office/word/2020/wordml/sdtdatahash" xmlns:w16sdtfl="http://schemas.microsoft.com/office/word/2024/wordml/sdtformatlock" xmlns:w16se="http://schemas.microsoft.com/office/word/2015/wordml/symex" xmlns:wpg="http://schemas.microsoft.com/office/word/2010/wordprocessingGroup" xmlns:wpi="http://schemas.microsoft.com/office/word/2010/wordprocessingInk" xmlns:wne="http://schemas.microsoft.com/office/word/2006/wordml" xmlns:wps="http://schemas.microsoft.com/office/word/2010/wordprocessingShape" mc:Ignorable="w14 w15 w16se w16cid w16 w16cex w16sdtdh w16sdtfl w16du wp14">
   <w:body>
     <w:p>
       <w:pPr>
@@ -291,7 +291,6 @@
           <w:lang w:val="en-US"/>
         </w:rPr>
       </w:pPr>
-      <w:proofErr w:type="spellStart"/>
       <w:r>
         <w:rPr>
           <w:rFonts w:ascii="Times New Roman" w:hAnsi="Times New Roman" w:cs="Times New Roman"/>
@@ -299,57 +298,7 @@
           <w:szCs w:val="24"/>
           <w:lang w:val="en-US"/>
         </w:rPr>
-        <w:t>Подготовить</w:t>
-      </w:r>
-      <w:proofErr w:type="spellEnd"/>
-      <w:r>
-        <w:rPr>
-          <w:rFonts w:ascii="Times New Roman" w:hAnsi="Times New Roman" w:cs="Times New Roman"/>
-          <w:sz w:val="24"/>
-          <w:szCs w:val="24"/>
-          <w:lang w:val="en-US"/>
-        </w:rPr>
-        <w:t xml:space="preserve"> и </w:t>
-      </w:r>
-      <w:proofErr w:type="spellStart"/>
-      <w:r>
-        <w:rPr>
-          <w:rFonts w:ascii="Times New Roman" w:hAnsi="Times New Roman" w:cs="Times New Roman"/>
-          <w:sz w:val="24"/>
-          <w:szCs w:val="24"/>
-          <w:lang w:val="en-US"/>
-        </w:rPr>
-        <w:t>загрузить</w:t>
-      </w:r>
-      <w:proofErr w:type="spellEnd"/>
-      <w:r>
-        <w:rPr>
-          <w:rFonts w:ascii="Times New Roman" w:hAnsi="Times New Roman" w:cs="Times New Roman"/>
-          <w:sz w:val="24"/>
-          <w:szCs w:val="24"/>
-          <w:lang w:val="en-US"/>
-        </w:rPr>
-        <w:t xml:space="preserve"> </w:t>
-      </w:r>
-      <w:proofErr w:type="spellStart"/>
-      <w:r>
-        <w:rPr>
-          <w:rFonts w:ascii="Times New Roman" w:hAnsi="Times New Roman" w:cs="Times New Roman"/>
-          <w:sz w:val="24"/>
-          <w:szCs w:val="24"/>
-          <w:lang w:val="en-US"/>
-        </w:rPr>
-        <w:t>отчет</w:t>
-      </w:r>
-      <w:proofErr w:type="spellEnd"/>
-      <w:r>
-        <w:rPr>
-          <w:rFonts w:ascii="Times New Roman" w:hAnsi="Times New Roman" w:cs="Times New Roman"/>
-          <w:sz w:val="24"/>
-          <w:szCs w:val="24"/>
-          <w:lang w:val="en-US"/>
-        </w:rPr>
-        <w:t>.</w:t>
+        <w:t>Подготовить и загрузить отчет.</w:t>
       </w:r>
     </w:p>
     <w:p>
@@ -655,10 +604,19 @@
                 <w:lang w:eastAsia="ru-RU"/>
                 <w14:ligatures w14:val="none"/>
               </w:rPr>
-              <w:t xml:space="preserve">GDP </w:t>
-            </w:r>
-            <w:proofErr w:type="spellStart"/>
-            <w:r>
+              <w:t>GDP per capita (USD)</w:t>
+            </w:r>
+          </w:p>
+        </w:tc>
+        <w:tc>
+          <w:tcPr>
+            <w:tcW w:w="1540" w:type="dxa"/>
+            <w:hideMark/>
+          </w:tcPr>
+          <w:p>
+            <w:pPr>
+              <w:jc w:val="both"/>
+              <w:cnfStyle w:val="100000000000" w:firstRow="1" w:lastRow="0" w:firstColumn="0" w:lastColumn="0" w:oddVBand="0" w:evenVBand="0" w:oddHBand="0" w:evenHBand="0" w:firstRowFirstColumn="0" w:firstRowLastColumn="0" w:lastRowFirstColumn="0" w:lastRowLastColumn="0"/>
               <w:rPr>
                 <w:rFonts w:ascii="Times New Roman" w:eastAsia="Times New Roman" w:hAnsi="Times New Roman" w:cs="Times New Roman"/>
                 <w:color w:val="FFFFFF"/>
@@ -668,9 +626,7 @@
                 <w:lang w:eastAsia="ru-RU"/>
                 <w14:ligatures w14:val="none"/>
               </w:rPr>
-              <w:t>per</w:t>
-            </w:r>
-            <w:proofErr w:type="spellEnd"/>
+            </w:pPr>
             <w:r>
               <w:rPr>
                 <w:rFonts w:ascii="Times New Roman" w:eastAsia="Times New Roman" w:hAnsi="Times New Roman" w:cs="Times New Roman"/>
@@ -681,10 +637,19 @@
                 <w:lang w:eastAsia="ru-RU"/>
                 <w14:ligatures w14:val="none"/>
               </w:rPr>
-              <w:t xml:space="preserve"> </w:t>
-            </w:r>
-            <w:proofErr w:type="spellStart"/>
-            <w:r>
+              <w:t xml:space="preserve">  Life expectancy</w:t>
+            </w:r>
+          </w:p>
+        </w:tc>
+        <w:tc>
+          <w:tcPr>
+            <w:tcW w:w="1360" w:type="dxa"/>
+            <w:hideMark/>
+          </w:tcPr>
+          <w:p>
+            <w:pPr>
+              <w:jc w:val="both"/>
+              <w:cnfStyle w:val="100000000000" w:firstRow="1" w:lastRow="0" w:firstColumn="0" w:lastColumn="0" w:oddVBand="0" w:evenVBand="0" w:oddHBand="0" w:evenHBand="0" w:firstRowFirstColumn="0" w:firstRowLastColumn="0" w:lastRowFirstColumn="0" w:lastRowLastColumn="0"/>
               <w:rPr>
                 <w:rFonts w:ascii="Times New Roman" w:eastAsia="Times New Roman" w:hAnsi="Times New Roman" w:cs="Times New Roman"/>
                 <w:color w:val="FFFFFF"/>
@@ -694,9 +659,7 @@
                 <w:lang w:eastAsia="ru-RU"/>
                 <w14:ligatures w14:val="none"/>
               </w:rPr>
-              <w:t>capita</w:t>
-            </w:r>
-            <w:proofErr w:type="spellEnd"/>
+            </w:pPr>
             <w:r>
               <w:rPr>
                 <w:rFonts w:ascii="Times New Roman" w:eastAsia="Times New Roman" w:hAnsi="Times New Roman" w:cs="Times New Roman"/>
@@ -707,13 +670,13 @@
                 <w:lang w:eastAsia="ru-RU"/>
                 <w14:ligatures w14:val="none"/>
               </w:rPr>
-              <w:t xml:space="preserve"> (USD)</w:t>
-            </w:r>
-          </w:p>
-        </w:tc>
-        <w:tc>
-          <w:tcPr>
-            <w:tcW w:w="1540" w:type="dxa"/>
+              <w:t>Employment rate</w:t>
+            </w:r>
+          </w:p>
+        </w:tc>
+        <w:tc>
+          <w:tcPr>
+            <w:tcW w:w="2240" w:type="dxa"/>
             <w:hideMark/>
           </w:tcPr>
           <w:p>
@@ -740,182 +703,8 @@
                 <w:lang w:eastAsia="ru-RU"/>
                 <w14:ligatures w14:val="none"/>
               </w:rPr>
-              <w:t xml:space="preserve">  Life </w:t>
-            </w:r>
-            <w:proofErr w:type="spellStart"/>
-            <w:r>
-              <w:rPr>
-                <w:rFonts w:ascii="Times New Roman" w:eastAsia="Times New Roman" w:hAnsi="Times New Roman" w:cs="Times New Roman"/>
-                <w:color w:val="FFFFFF"/>
-                <w:kern w:val="0"/>
-                <w:sz w:val="24"/>
-                <w:szCs w:val="24"/>
-                <w:lang w:eastAsia="ru-RU"/>
-                <w14:ligatures w14:val="none"/>
-              </w:rPr>
-              <w:t>expectancy</w:t>
-            </w:r>
-            <w:proofErr w:type="spellEnd"/>
-          </w:p>
-        </w:tc>
-        <w:tc>
-          <w:tcPr>
-            <w:tcW w:w="1360" w:type="dxa"/>
-            <w:hideMark/>
-          </w:tcPr>
-          <w:p>
-            <w:pPr>
-              <w:jc w:val="both"/>
-              <w:cnfStyle w:val="100000000000" w:firstRow="1" w:lastRow="0" w:firstColumn="0" w:lastColumn="0" w:oddVBand="0" w:evenVBand="0" w:oddHBand="0" w:evenHBand="0" w:firstRowFirstColumn="0" w:firstRowLastColumn="0" w:lastRowFirstColumn="0" w:lastRowLastColumn="0"/>
-              <w:rPr>
-                <w:rFonts w:ascii="Times New Roman" w:eastAsia="Times New Roman" w:hAnsi="Times New Roman" w:cs="Times New Roman"/>
-                <w:color w:val="FFFFFF"/>
-                <w:kern w:val="0"/>
-                <w:sz w:val="24"/>
-                <w:szCs w:val="24"/>
-                <w:lang w:eastAsia="ru-RU"/>
-                <w14:ligatures w14:val="none"/>
-              </w:rPr>
-            </w:pPr>
-            <w:proofErr w:type="spellStart"/>
-            <w:r>
-              <w:rPr>
-                <w:rFonts w:ascii="Times New Roman" w:eastAsia="Times New Roman" w:hAnsi="Times New Roman" w:cs="Times New Roman"/>
-                <w:color w:val="FFFFFF"/>
-                <w:kern w:val="0"/>
-                <w:sz w:val="24"/>
-                <w:szCs w:val="24"/>
-                <w:lang w:eastAsia="ru-RU"/>
-                <w14:ligatures w14:val="none"/>
-              </w:rPr>
-              <w:t>Employment</w:t>
-            </w:r>
-            <w:proofErr w:type="spellEnd"/>
-            <w:r>
-              <w:rPr>
-                <w:rFonts w:ascii="Times New Roman" w:eastAsia="Times New Roman" w:hAnsi="Times New Roman" w:cs="Times New Roman"/>
-                <w:color w:val="FFFFFF"/>
-                <w:kern w:val="0"/>
-                <w:sz w:val="24"/>
-                <w:szCs w:val="24"/>
-                <w:lang w:eastAsia="ru-RU"/>
-                <w14:ligatures w14:val="none"/>
-              </w:rPr>
-              <w:t xml:space="preserve"> </w:t>
-            </w:r>
-            <w:proofErr w:type="spellStart"/>
-            <w:r>
-              <w:rPr>
-                <w:rFonts w:ascii="Times New Roman" w:eastAsia="Times New Roman" w:hAnsi="Times New Roman" w:cs="Times New Roman"/>
-                <w:color w:val="FFFFFF"/>
-                <w:kern w:val="0"/>
-                <w:sz w:val="24"/>
-                <w:szCs w:val="24"/>
-                <w:lang w:eastAsia="ru-RU"/>
-                <w14:ligatures w14:val="none"/>
-              </w:rPr>
-              <w:t>rate</w:t>
-            </w:r>
-            <w:proofErr w:type="spellEnd"/>
-          </w:p>
-        </w:tc>
-        <w:tc>
-          <w:tcPr>
-            <w:tcW w:w="2240" w:type="dxa"/>
-            <w:hideMark/>
-          </w:tcPr>
-          <w:p>
-            <w:pPr>
-              <w:jc w:val="both"/>
-              <w:cnfStyle w:val="100000000000" w:firstRow="1" w:lastRow="0" w:firstColumn="0" w:lastColumn="0" w:oddVBand="0" w:evenVBand="0" w:oddHBand="0" w:evenHBand="0" w:firstRowFirstColumn="0" w:firstRowLastColumn="0" w:lastRowFirstColumn="0" w:lastRowLastColumn="0"/>
-              <w:rPr>
-                <w:rFonts w:ascii="Times New Roman" w:eastAsia="Times New Roman" w:hAnsi="Times New Roman" w:cs="Times New Roman"/>
-                <w:color w:val="FFFFFF"/>
-                <w:kern w:val="0"/>
-                <w:sz w:val="24"/>
-                <w:szCs w:val="24"/>
-                <w:lang w:eastAsia="ru-RU"/>
-                <w14:ligatures w14:val="none"/>
-              </w:rPr>
-            </w:pPr>
-            <w:r>
-              <w:rPr>
-                <w:rFonts w:ascii="Times New Roman" w:eastAsia="Times New Roman" w:hAnsi="Times New Roman" w:cs="Times New Roman"/>
-                <w:color w:val="FFFFFF"/>
-                <w:kern w:val="0"/>
-                <w:sz w:val="24"/>
-                <w:szCs w:val="24"/>
-                <w:lang w:eastAsia="ru-RU"/>
-                <w14:ligatures w14:val="none"/>
-              </w:rPr>
-              <w:t xml:space="preserve">  Quality </w:t>
-            </w:r>
-            <w:proofErr w:type="spellStart"/>
-            <w:r>
-              <w:rPr>
-                <w:rFonts w:ascii="Times New Roman" w:eastAsia="Times New Roman" w:hAnsi="Times New Roman" w:cs="Times New Roman"/>
-                <w:color w:val="FFFFFF"/>
-                <w:kern w:val="0"/>
-                <w:sz w:val="24"/>
-                <w:szCs w:val="24"/>
-                <w:lang w:eastAsia="ru-RU"/>
-                <w14:ligatures w14:val="none"/>
-              </w:rPr>
-              <w:t>of</w:t>
-            </w:r>
-            <w:proofErr w:type="spellEnd"/>
-            <w:r>
-              <w:rPr>
-                <w:rFonts w:ascii="Times New Roman" w:eastAsia="Times New Roman" w:hAnsi="Times New Roman" w:cs="Times New Roman"/>
-                <w:color w:val="FFFFFF"/>
-                <w:kern w:val="0"/>
-                <w:sz w:val="24"/>
-                <w:szCs w:val="24"/>
-                <w:lang w:eastAsia="ru-RU"/>
-                <w14:ligatures w14:val="none"/>
-              </w:rPr>
-              <w:t xml:space="preserve"> </w:t>
-            </w:r>
-            <w:proofErr w:type="spellStart"/>
-            <w:r>
-              <w:rPr>
-                <w:rFonts w:ascii="Times New Roman" w:eastAsia="Times New Roman" w:hAnsi="Times New Roman" w:cs="Times New Roman"/>
-                <w:color w:val="FFFFFF"/>
-                <w:kern w:val="0"/>
-                <w:sz w:val="24"/>
-                <w:szCs w:val="24"/>
-                <w:lang w:eastAsia="ru-RU"/>
-                <w14:ligatures w14:val="none"/>
-              </w:rPr>
-              <w:t>support</w:t>
-            </w:r>
-            <w:proofErr w:type="spellEnd"/>
-            <w:r>
-              <w:rPr>
-                <w:rFonts w:ascii="Times New Roman" w:eastAsia="Times New Roman" w:hAnsi="Times New Roman" w:cs="Times New Roman"/>
-                <w:color w:val="FFFFFF"/>
-                <w:kern w:val="0"/>
-                <w:sz w:val="24"/>
-                <w:szCs w:val="24"/>
-                <w:lang w:eastAsia="ru-RU"/>
-                <w14:ligatures w14:val="none"/>
-              </w:rPr>
-              <w:t xml:space="preserve"> </w:t>
-            </w:r>
-            <w:proofErr w:type="spellStart"/>
-            <w:r>
-              <w:rPr>
-                <w:rFonts w:ascii="Times New Roman" w:eastAsia="Times New Roman" w:hAnsi="Times New Roman" w:cs="Times New Roman"/>
-                <w:color w:val="FFFFFF"/>
-                <w:kern w:val="0"/>
-                <w:sz w:val="24"/>
-                <w:szCs w:val="24"/>
-                <w:lang w:eastAsia="ru-RU"/>
-                <w14:ligatures w14:val="none"/>
-              </w:rPr>
-              <w:t>network</w:t>
-            </w:r>
-            <w:proofErr w:type="spellEnd"/>
+              <w:t xml:space="preserve">  Quality of support network</w:t>
+            </w:r>
           </w:p>
         </w:tc>
       </w:tr>
@@ -945,7 +734,6 @@
                 <w14:ligatures w14:val="none"/>
               </w:rPr>
             </w:pPr>
-            <w:proofErr w:type="spellStart"/>
             <w:r>
               <w:rPr>
                 <w:rFonts w:ascii="Times New Roman" w:eastAsia="Times New Roman" w:hAnsi="Times New Roman" w:cs="Times New Roman"/>
@@ -958,7 +746,6 @@
               </w:rPr>
               <w:t>Australia</w:t>
             </w:r>
-            <w:proofErr w:type="spellEnd"/>
           </w:p>
         </w:tc>
         <w:tc>
@@ -1300,7 +1087,6 @@
                 <w14:ligatures w14:val="none"/>
               </w:rPr>
             </w:pPr>
-            <w:proofErr w:type="spellStart"/>
             <w:r>
               <w:rPr>
                 <w:rFonts w:ascii="Times New Roman" w:eastAsia="Times New Roman" w:hAnsi="Times New Roman" w:cs="Times New Roman"/>
@@ -1313,7 +1099,6 @@
               </w:rPr>
               <w:t>Denmark</w:t>
             </w:r>
-            <w:proofErr w:type="spellEnd"/>
           </w:p>
         </w:tc>
         <w:tc>
@@ -1655,7 +1440,6 @@
                 <w14:ligatures w14:val="none"/>
               </w:rPr>
             </w:pPr>
-            <w:proofErr w:type="spellStart"/>
             <w:r>
               <w:rPr>
                 <w:rFonts w:ascii="Times New Roman" w:eastAsia="Times New Roman" w:hAnsi="Times New Roman" w:cs="Times New Roman"/>
@@ -1668,7 +1452,6 @@
               </w:rPr>
               <w:t>Germany</w:t>
             </w:r>
-            <w:proofErr w:type="spellEnd"/>
           </w:p>
         </w:tc>
         <w:tc>
@@ -1833,7 +1616,6 @@
                 <w14:ligatures w14:val="none"/>
               </w:rPr>
             </w:pPr>
-            <w:proofErr w:type="spellStart"/>
             <w:r>
               <w:rPr>
                 <w:rFonts w:ascii="Times New Roman" w:eastAsia="Times New Roman" w:hAnsi="Times New Roman" w:cs="Times New Roman"/>
@@ -1846,7 +1628,6 @@
               </w:rPr>
               <w:t>Netherlands</w:t>
             </w:r>
-            <w:proofErr w:type="spellEnd"/>
           </w:p>
         </w:tc>
         <w:tc>
@@ -2012,7 +1793,6 @@
                 <w14:ligatures w14:val="none"/>
               </w:rPr>
             </w:pPr>
-            <w:proofErr w:type="spellStart"/>
             <w:r>
               <w:rPr>
                 <w:rFonts w:ascii="Times New Roman" w:eastAsia="Times New Roman" w:hAnsi="Times New Roman" w:cs="Times New Roman"/>
@@ -2025,7 +1805,6 @@
               </w:rPr>
               <w:t>Norway</w:t>
             </w:r>
-            <w:proofErr w:type="spellEnd"/>
           </w:p>
         </w:tc>
         <w:tc>
@@ -2190,7 +1969,6 @@
                 <w14:ligatures w14:val="none"/>
               </w:rPr>
             </w:pPr>
-            <w:proofErr w:type="spellStart"/>
             <w:r>
               <w:rPr>
                 <w:rFonts w:ascii="Times New Roman" w:eastAsia="Times New Roman" w:hAnsi="Times New Roman" w:cs="Times New Roman"/>
@@ -2203,7 +1981,6 @@
               </w:rPr>
               <w:t>Switzerland</w:t>
             </w:r>
-            <w:proofErr w:type="spellEnd"/>
           </w:p>
         </w:tc>
         <w:tc>
@@ -2379,22 +2156,8 @@
                 <w:lang w:eastAsia="ru-RU"/>
                 <w14:ligatures w14:val="none"/>
               </w:rPr>
-              <w:t xml:space="preserve">United </w:t>
-            </w:r>
-            <w:proofErr w:type="spellStart"/>
-            <w:r>
-              <w:rPr>
-                <w:rFonts w:ascii="Times New Roman" w:eastAsia="Times New Roman" w:hAnsi="Times New Roman" w:cs="Times New Roman"/>
-                <w:color w:val="000000"/>
-                <w:kern w:val="0"/>
-                <w:sz w:val="24"/>
-                <w:szCs w:val="24"/>
-                <w:lang w:eastAsia="ru-RU"/>
-                <w14:ligatures w14:val="none"/>
-              </w:rPr>
-              <w:t>Kingdom</w:t>
-            </w:r>
-            <w:proofErr w:type="spellEnd"/>
+              <w:t>United Kingdom</w:t>
+            </w:r>
           </w:p>
         </w:tc>
         <w:tc>
@@ -2569,22 +2332,8 @@
                 <w:lang w:eastAsia="ru-RU"/>
                 <w14:ligatures w14:val="none"/>
               </w:rPr>
-              <w:t xml:space="preserve">United </w:t>
-            </w:r>
-            <w:proofErr w:type="spellStart"/>
-            <w:r>
-              <w:rPr>
-                <w:rFonts w:ascii="Times New Roman" w:eastAsia="Times New Roman" w:hAnsi="Times New Roman" w:cs="Times New Roman"/>
-                <w:color w:val="000000"/>
-                <w:kern w:val="0"/>
-                <w:sz w:val="24"/>
-                <w:szCs w:val="24"/>
-                <w:lang w:eastAsia="ru-RU"/>
-                <w14:ligatures w14:val="none"/>
-              </w:rPr>
-              <w:t>States</w:t>
-            </w:r>
-            <w:proofErr w:type="spellEnd"/>
+              <w:t>United States</w:t>
+            </w:r>
           </w:p>
         </w:tc>
         <w:tc>
@@ -2827,7 +2576,6 @@
               <w:bottom w:val="nil"/>
               <w:right w:val="nil"/>
             </w:tcBorders>
-            <w:shd w:val="clear" w:color="auto" w:fill="auto"/>
             <w:noWrap/>
             <w:vAlign w:val="bottom"/>
             <w:hideMark/>
@@ -2869,7 +2617,6 @@
               <w:bottom w:val="nil"/>
               <w:right w:val="nil"/>
             </w:tcBorders>
-            <w:shd w:val="clear" w:color="auto" w:fill="auto"/>
             <w:noWrap/>
             <w:vAlign w:val="bottom"/>
             <w:hideMark/>
@@ -2911,7 +2658,6 @@
               <w:bottom w:val="nil"/>
               <w:right w:val="nil"/>
             </w:tcBorders>
-            <w:shd w:val="clear" w:color="auto" w:fill="auto"/>
             <w:noWrap/>
             <w:vAlign w:val="bottom"/>
             <w:hideMark/>
@@ -2953,7 +2699,6 @@
               <w:bottom w:val="nil"/>
               <w:right w:val="nil"/>
             </w:tcBorders>
-            <w:shd w:val="clear" w:color="auto" w:fill="auto"/>
             <w:noWrap/>
             <w:vAlign w:val="bottom"/>
             <w:hideMark/>
@@ -3001,7 +2746,6 @@
               <w:bottom w:val="nil"/>
               <w:right w:val="nil"/>
             </w:tcBorders>
-            <w:shd w:val="clear" w:color="auto" w:fill="auto"/>
             <w:noWrap/>
             <w:vAlign w:val="bottom"/>
             <w:hideMark/>
@@ -3043,7 +2787,6 @@
               <w:bottom w:val="nil"/>
               <w:right w:val="nil"/>
             </w:tcBorders>
-            <w:shd w:val="clear" w:color="auto" w:fill="auto"/>
             <w:noWrap/>
             <w:vAlign w:val="bottom"/>
             <w:hideMark/>
@@ -3085,7 +2828,6 @@
               <w:bottom w:val="nil"/>
               <w:right w:val="nil"/>
             </w:tcBorders>
-            <w:shd w:val="clear" w:color="auto" w:fill="auto"/>
             <w:noWrap/>
             <w:vAlign w:val="bottom"/>
             <w:hideMark/>
@@ -3127,7 +2869,6 @@
               <w:bottom w:val="nil"/>
               <w:right w:val="nil"/>
             </w:tcBorders>
-            <w:shd w:val="clear" w:color="auto" w:fill="auto"/>
             <w:noWrap/>
             <w:vAlign w:val="bottom"/>
             <w:hideMark/>
@@ -3175,7 +2916,6 @@
               <w:bottom w:val="nil"/>
               <w:right w:val="nil"/>
             </w:tcBorders>
-            <w:shd w:val="clear" w:color="auto" w:fill="auto"/>
             <w:noWrap/>
             <w:vAlign w:val="bottom"/>
             <w:hideMark/>
@@ -3217,7 +2957,6 @@
               <w:bottom w:val="nil"/>
               <w:right w:val="nil"/>
             </w:tcBorders>
-            <w:shd w:val="clear" w:color="auto" w:fill="auto"/>
             <w:noWrap/>
             <w:vAlign w:val="bottom"/>
             <w:hideMark/>
@@ -3259,7 +2998,6 @@
               <w:bottom w:val="nil"/>
               <w:right w:val="nil"/>
             </w:tcBorders>
-            <w:shd w:val="clear" w:color="auto" w:fill="auto"/>
             <w:noWrap/>
             <w:vAlign w:val="bottom"/>
             <w:hideMark/>
@@ -3301,7 +3039,6 @@
               <w:bottom w:val="nil"/>
               <w:right w:val="nil"/>
             </w:tcBorders>
-            <w:shd w:val="clear" w:color="auto" w:fill="auto"/>
             <w:noWrap/>
             <w:vAlign w:val="bottom"/>
             <w:hideMark/>
@@ -3349,7 +3086,6 @@
               <w:bottom w:val="nil"/>
               <w:right w:val="nil"/>
             </w:tcBorders>
-            <w:shd w:val="clear" w:color="auto" w:fill="auto"/>
             <w:noWrap/>
             <w:vAlign w:val="bottom"/>
             <w:hideMark/>
@@ -3391,7 +3127,6 @@
               <w:bottom w:val="nil"/>
               <w:right w:val="nil"/>
             </w:tcBorders>
-            <w:shd w:val="clear" w:color="auto" w:fill="auto"/>
             <w:noWrap/>
             <w:vAlign w:val="bottom"/>
             <w:hideMark/>
@@ -3433,7 +3168,6 @@
               <w:bottom w:val="nil"/>
               <w:right w:val="nil"/>
             </w:tcBorders>
-            <w:shd w:val="clear" w:color="auto" w:fill="auto"/>
             <w:noWrap/>
             <w:vAlign w:val="bottom"/>
             <w:hideMark/>
@@ -3475,7 +3209,6 @@
               <w:bottom w:val="nil"/>
               <w:right w:val="nil"/>
             </w:tcBorders>
-            <w:shd w:val="clear" w:color="auto" w:fill="auto"/>
             <w:noWrap/>
             <w:vAlign w:val="bottom"/>
             <w:hideMark/>
@@ -3523,7 +3256,6 @@
               <w:bottom w:val="nil"/>
               <w:right w:val="nil"/>
             </w:tcBorders>
-            <w:shd w:val="clear" w:color="auto" w:fill="auto"/>
             <w:noWrap/>
             <w:vAlign w:val="bottom"/>
             <w:hideMark/>
@@ -3565,7 +3297,6 @@
               <w:bottom w:val="nil"/>
               <w:right w:val="nil"/>
             </w:tcBorders>
-            <w:shd w:val="clear" w:color="auto" w:fill="auto"/>
             <w:noWrap/>
             <w:vAlign w:val="bottom"/>
             <w:hideMark/>
@@ -3607,7 +3338,6 @@
               <w:bottom w:val="nil"/>
               <w:right w:val="nil"/>
             </w:tcBorders>
-            <w:shd w:val="clear" w:color="auto" w:fill="auto"/>
             <w:noWrap/>
             <w:vAlign w:val="bottom"/>
             <w:hideMark/>
@@ -3649,7 +3379,6 @@
               <w:bottom w:val="nil"/>
               <w:right w:val="nil"/>
             </w:tcBorders>
-            <w:shd w:val="clear" w:color="auto" w:fill="auto"/>
             <w:noWrap/>
             <w:vAlign w:val="bottom"/>
             <w:hideMark/>
@@ -3697,7 +3426,6 @@
               <w:bottom w:val="nil"/>
               <w:right w:val="nil"/>
             </w:tcBorders>
-            <w:shd w:val="clear" w:color="auto" w:fill="auto"/>
             <w:noWrap/>
             <w:vAlign w:val="bottom"/>
             <w:hideMark/>
@@ -3739,7 +3467,6 @@
               <w:bottom w:val="nil"/>
               <w:right w:val="nil"/>
             </w:tcBorders>
-            <w:shd w:val="clear" w:color="auto" w:fill="auto"/>
             <w:noWrap/>
             <w:vAlign w:val="bottom"/>
             <w:hideMark/>
@@ -3781,7 +3508,6 @@
               <w:bottom w:val="nil"/>
               <w:right w:val="nil"/>
             </w:tcBorders>
-            <w:shd w:val="clear" w:color="auto" w:fill="auto"/>
             <w:noWrap/>
             <w:vAlign w:val="bottom"/>
             <w:hideMark/>
@@ -3823,7 +3549,6 @@
               <w:bottom w:val="nil"/>
               <w:right w:val="nil"/>
             </w:tcBorders>
-            <w:shd w:val="clear" w:color="auto" w:fill="auto"/>
             <w:noWrap/>
             <w:vAlign w:val="bottom"/>
             <w:hideMark/>
@@ -3871,7 +3596,6 @@
               <w:bottom w:val="nil"/>
               <w:right w:val="nil"/>
             </w:tcBorders>
-            <w:shd w:val="clear" w:color="auto" w:fill="auto"/>
             <w:noWrap/>
             <w:vAlign w:val="bottom"/>
             <w:hideMark/>
@@ -3913,7 +3637,6 @@
               <w:bottom w:val="nil"/>
               <w:right w:val="nil"/>
             </w:tcBorders>
-            <w:shd w:val="clear" w:color="auto" w:fill="auto"/>
             <w:noWrap/>
             <w:vAlign w:val="bottom"/>
             <w:hideMark/>
@@ -3955,7 +3678,6 @@
               <w:bottom w:val="nil"/>
               <w:right w:val="nil"/>
             </w:tcBorders>
-            <w:shd w:val="clear" w:color="auto" w:fill="auto"/>
             <w:noWrap/>
             <w:vAlign w:val="bottom"/>
             <w:hideMark/>
@@ -3997,7 +3719,6 @@
               <w:bottom w:val="nil"/>
               <w:right w:val="nil"/>
             </w:tcBorders>
-            <w:shd w:val="clear" w:color="auto" w:fill="auto"/>
             <w:noWrap/>
             <w:vAlign w:val="bottom"/>
             <w:hideMark/>
@@ -4045,7 +3766,6 @@
               <w:bottom w:val="nil"/>
               <w:right w:val="nil"/>
             </w:tcBorders>
-            <w:shd w:val="clear" w:color="auto" w:fill="auto"/>
             <w:noWrap/>
             <w:vAlign w:val="bottom"/>
             <w:hideMark/>
@@ -4087,7 +3807,6 @@
               <w:bottom w:val="nil"/>
               <w:right w:val="nil"/>
             </w:tcBorders>
-            <w:shd w:val="clear" w:color="auto" w:fill="auto"/>
             <w:noWrap/>
             <w:vAlign w:val="bottom"/>
             <w:hideMark/>
@@ -4129,7 +3848,6 @@
               <w:bottom w:val="nil"/>
               <w:right w:val="nil"/>
             </w:tcBorders>
-            <w:shd w:val="clear" w:color="auto" w:fill="auto"/>
             <w:noWrap/>
             <w:vAlign w:val="bottom"/>
             <w:hideMark/>
@@ -4171,7 +3889,6 @@
               <w:bottom w:val="nil"/>
               <w:right w:val="nil"/>
             </w:tcBorders>
-            <w:shd w:val="clear" w:color="auto" w:fill="auto"/>
             <w:noWrap/>
             <w:vAlign w:val="bottom"/>
             <w:hideMark/>
@@ -4219,7 +3936,6 @@
               <w:bottom w:val="nil"/>
               <w:right w:val="nil"/>
             </w:tcBorders>
-            <w:shd w:val="clear" w:color="auto" w:fill="auto"/>
             <w:noWrap/>
             <w:vAlign w:val="bottom"/>
             <w:hideMark/>
@@ -4261,7 +3977,6 @@
               <w:bottom w:val="nil"/>
               <w:right w:val="nil"/>
             </w:tcBorders>
-            <w:shd w:val="clear" w:color="auto" w:fill="auto"/>
             <w:noWrap/>
             <w:vAlign w:val="bottom"/>
             <w:hideMark/>
@@ -4303,7 +4018,6 @@
               <w:bottom w:val="nil"/>
               <w:right w:val="nil"/>
             </w:tcBorders>
-            <w:shd w:val="clear" w:color="auto" w:fill="auto"/>
             <w:noWrap/>
             <w:vAlign w:val="bottom"/>
             <w:hideMark/>
@@ -4345,7 +4059,6 @@
               <w:bottom w:val="nil"/>
               <w:right w:val="nil"/>
             </w:tcBorders>
-            <w:shd w:val="clear" w:color="auto" w:fill="auto"/>
             <w:noWrap/>
             <w:vAlign w:val="bottom"/>
             <w:hideMark/>
@@ -4393,7 +4106,6 @@
               <w:bottom w:val="nil"/>
               <w:right w:val="nil"/>
             </w:tcBorders>
-            <w:shd w:val="clear" w:color="auto" w:fill="auto"/>
             <w:noWrap/>
             <w:vAlign w:val="bottom"/>
             <w:hideMark/>
@@ -4435,7 +4147,6 @@
               <w:bottom w:val="nil"/>
               <w:right w:val="nil"/>
             </w:tcBorders>
-            <w:shd w:val="clear" w:color="auto" w:fill="auto"/>
             <w:noWrap/>
             <w:vAlign w:val="bottom"/>
             <w:hideMark/>
@@ -4477,7 +4188,6 @@
               <w:bottom w:val="nil"/>
               <w:right w:val="nil"/>
             </w:tcBorders>
-            <w:shd w:val="clear" w:color="auto" w:fill="auto"/>
             <w:noWrap/>
             <w:vAlign w:val="bottom"/>
             <w:hideMark/>
@@ -4519,7 +4229,6 @@
               <w:bottom w:val="nil"/>
               <w:right w:val="nil"/>
             </w:tcBorders>
-            <w:shd w:val="clear" w:color="auto" w:fill="auto"/>
             <w:noWrap/>
             <w:vAlign w:val="bottom"/>
             <w:hideMark/>
@@ -4567,7 +4276,6 @@
               <w:bottom w:val="nil"/>
               <w:right w:val="nil"/>
             </w:tcBorders>
-            <w:shd w:val="clear" w:color="auto" w:fill="auto"/>
             <w:noWrap/>
             <w:vAlign w:val="bottom"/>
           </w:tcPr>
@@ -4596,7 +4304,6 @@
               <w:bottom w:val="nil"/>
               <w:right w:val="nil"/>
             </w:tcBorders>
-            <w:shd w:val="clear" w:color="auto" w:fill="auto"/>
             <w:noWrap/>
             <w:vAlign w:val="bottom"/>
           </w:tcPr>
@@ -4625,7 +4332,6 @@
               <w:bottom w:val="nil"/>
               <w:right w:val="nil"/>
             </w:tcBorders>
-            <w:shd w:val="clear" w:color="auto" w:fill="auto"/>
             <w:noWrap/>
             <w:vAlign w:val="bottom"/>
           </w:tcPr>
@@ -4654,7 +4360,6 @@
               <w:bottom w:val="nil"/>
               <w:right w:val="nil"/>
             </w:tcBorders>
-            <w:shd w:val="clear" w:color="auto" w:fill="auto"/>
             <w:noWrap/>
             <w:vAlign w:val="bottom"/>
           </w:tcPr>
@@ -4742,7 +4447,6 @@
               <w:bottom w:val="nil"/>
               <w:right w:val="nil"/>
             </w:tcBorders>
-            <w:shd w:val="clear" w:color="auto" w:fill="auto"/>
             <w:noWrap/>
             <w:vAlign w:val="bottom"/>
             <w:hideMark/>
@@ -4784,7 +4488,6 @@
               <w:bottom w:val="nil"/>
               <w:right w:val="nil"/>
             </w:tcBorders>
-            <w:shd w:val="clear" w:color="auto" w:fill="auto"/>
             <w:noWrap/>
             <w:vAlign w:val="bottom"/>
             <w:hideMark/>
@@ -4826,7 +4529,6 @@
               <w:bottom w:val="nil"/>
               <w:right w:val="nil"/>
             </w:tcBorders>
-            <w:shd w:val="clear" w:color="auto" w:fill="auto"/>
             <w:noWrap/>
             <w:vAlign w:val="bottom"/>
             <w:hideMark/>
@@ -4868,7 +4570,6 @@
               <w:bottom w:val="nil"/>
               <w:right w:val="nil"/>
             </w:tcBorders>
-            <w:shd w:val="clear" w:color="auto" w:fill="auto"/>
             <w:noWrap/>
             <w:vAlign w:val="bottom"/>
             <w:hideMark/>
@@ -4916,7 +4617,6 @@
               <w:bottom w:val="nil"/>
               <w:right w:val="nil"/>
             </w:tcBorders>
-            <w:shd w:val="clear" w:color="auto" w:fill="auto"/>
             <w:noWrap/>
             <w:vAlign w:val="bottom"/>
             <w:hideMark/>
@@ -4958,7 +4658,6 @@
               <w:bottom w:val="nil"/>
               <w:right w:val="nil"/>
             </w:tcBorders>
-            <w:shd w:val="clear" w:color="auto" w:fill="auto"/>
             <w:noWrap/>
             <w:vAlign w:val="bottom"/>
             <w:hideMark/>
@@ -5000,7 +4699,6 @@
               <w:bottom w:val="nil"/>
               <w:right w:val="nil"/>
             </w:tcBorders>
-            <w:shd w:val="clear" w:color="auto" w:fill="auto"/>
             <w:noWrap/>
             <w:vAlign w:val="bottom"/>
             <w:hideMark/>
@@ -5042,7 +4740,6 @@
               <w:bottom w:val="nil"/>
               <w:right w:val="nil"/>
             </w:tcBorders>
-            <w:shd w:val="clear" w:color="auto" w:fill="auto"/>
             <w:noWrap/>
             <w:vAlign w:val="bottom"/>
             <w:hideMark/>
@@ -5090,7 +4787,6 @@
               <w:bottom w:val="nil"/>
               <w:right w:val="nil"/>
             </w:tcBorders>
-            <w:shd w:val="clear" w:color="auto" w:fill="auto"/>
             <w:noWrap/>
             <w:vAlign w:val="bottom"/>
             <w:hideMark/>
@@ -5132,7 +4828,6 @@
               <w:bottom w:val="nil"/>
               <w:right w:val="nil"/>
             </w:tcBorders>
-            <w:shd w:val="clear" w:color="auto" w:fill="auto"/>
             <w:noWrap/>
             <w:vAlign w:val="bottom"/>
             <w:hideMark/>
@@ -5174,7 +4869,6 @@
               <w:bottom w:val="nil"/>
               <w:right w:val="nil"/>
             </w:tcBorders>
-            <w:shd w:val="clear" w:color="auto" w:fill="auto"/>
             <w:noWrap/>
             <w:vAlign w:val="bottom"/>
             <w:hideMark/>
@@ -5216,7 +4910,6 @@
               <w:bottom w:val="nil"/>
               <w:right w:val="nil"/>
             </w:tcBorders>
-            <w:shd w:val="clear" w:color="auto" w:fill="auto"/>
             <w:noWrap/>
             <w:vAlign w:val="bottom"/>
             <w:hideMark/>
@@ -5264,7 +4957,6 @@
               <w:bottom w:val="nil"/>
               <w:right w:val="nil"/>
             </w:tcBorders>
-            <w:shd w:val="clear" w:color="auto" w:fill="auto"/>
             <w:noWrap/>
             <w:vAlign w:val="bottom"/>
             <w:hideMark/>
@@ -5306,7 +4998,6 @@
               <w:bottom w:val="nil"/>
               <w:right w:val="nil"/>
             </w:tcBorders>
-            <w:shd w:val="clear" w:color="auto" w:fill="auto"/>
             <w:noWrap/>
             <w:vAlign w:val="bottom"/>
             <w:hideMark/>
@@ -5348,7 +5039,6 @@
               <w:bottom w:val="nil"/>
               <w:right w:val="nil"/>
             </w:tcBorders>
-            <w:shd w:val="clear" w:color="auto" w:fill="auto"/>
             <w:noWrap/>
             <w:vAlign w:val="bottom"/>
             <w:hideMark/>
@@ -5390,7 +5080,6 @@
               <w:bottom w:val="nil"/>
               <w:right w:val="nil"/>
             </w:tcBorders>
-            <w:shd w:val="clear" w:color="auto" w:fill="auto"/>
             <w:noWrap/>
             <w:vAlign w:val="bottom"/>
             <w:hideMark/>
@@ -5503,7 +5192,6 @@
               <w:bottom w:val="nil"/>
               <w:right w:val="nil"/>
             </w:tcBorders>
-            <w:shd w:val="clear" w:color="auto" w:fill="auto"/>
             <w:noWrap/>
             <w:vAlign w:val="bottom"/>
             <w:hideMark/>
@@ -5545,7 +5233,6 @@
               <w:bottom w:val="nil"/>
               <w:right w:val="nil"/>
             </w:tcBorders>
-            <w:shd w:val="clear" w:color="auto" w:fill="auto"/>
             <w:noWrap/>
             <w:vAlign w:val="bottom"/>
             <w:hideMark/>
@@ -5587,7 +5274,6 @@
               <w:bottom w:val="nil"/>
               <w:right w:val="nil"/>
             </w:tcBorders>
-            <w:shd w:val="clear" w:color="auto" w:fill="auto"/>
             <w:noWrap/>
             <w:vAlign w:val="bottom"/>
             <w:hideMark/>
@@ -5629,7 +5315,6 @@
               <w:bottom w:val="nil"/>
               <w:right w:val="nil"/>
             </w:tcBorders>
-            <w:shd w:val="clear" w:color="auto" w:fill="auto"/>
             <w:noWrap/>
             <w:vAlign w:val="bottom"/>
             <w:hideMark/>
@@ -5677,7 +5362,6 @@
               <w:bottom w:val="nil"/>
               <w:right w:val="nil"/>
             </w:tcBorders>
-            <w:shd w:val="clear" w:color="auto" w:fill="auto"/>
             <w:noWrap/>
             <w:vAlign w:val="bottom"/>
             <w:hideMark/>
@@ -5719,7 +5403,6 @@
               <w:bottom w:val="nil"/>
               <w:right w:val="nil"/>
             </w:tcBorders>
-            <w:shd w:val="clear" w:color="auto" w:fill="auto"/>
             <w:noWrap/>
             <w:vAlign w:val="bottom"/>
             <w:hideMark/>
@@ -5761,7 +5444,6 @@
               <w:bottom w:val="nil"/>
               <w:right w:val="nil"/>
             </w:tcBorders>
-            <w:shd w:val="clear" w:color="auto" w:fill="auto"/>
             <w:noWrap/>
             <w:vAlign w:val="bottom"/>
             <w:hideMark/>
@@ -5803,7 +5485,6 @@
               <w:bottom w:val="nil"/>
               <w:right w:val="nil"/>
             </w:tcBorders>
-            <w:shd w:val="clear" w:color="auto" w:fill="auto"/>
             <w:noWrap/>
             <w:vAlign w:val="bottom"/>
             <w:hideMark/>
@@ -5851,7 +5532,6 @@
               <w:bottom w:val="nil"/>
               <w:right w:val="nil"/>
             </w:tcBorders>
-            <w:shd w:val="clear" w:color="auto" w:fill="auto"/>
             <w:noWrap/>
             <w:vAlign w:val="bottom"/>
             <w:hideMark/>
@@ -5893,7 +5573,6 @@
               <w:bottom w:val="nil"/>
               <w:right w:val="nil"/>
             </w:tcBorders>
-            <w:shd w:val="clear" w:color="auto" w:fill="auto"/>
             <w:noWrap/>
             <w:vAlign w:val="bottom"/>
             <w:hideMark/>
@@ -5935,7 +5614,6 @@
               <w:bottom w:val="nil"/>
               <w:right w:val="nil"/>
             </w:tcBorders>
-            <w:shd w:val="clear" w:color="auto" w:fill="auto"/>
             <w:noWrap/>
             <w:vAlign w:val="bottom"/>
             <w:hideMark/>
@@ -5977,7 +5655,6 @@
               <w:bottom w:val="nil"/>
               <w:right w:val="nil"/>
             </w:tcBorders>
-            <w:shd w:val="clear" w:color="auto" w:fill="auto"/>
             <w:noWrap/>
             <w:vAlign w:val="bottom"/>
             <w:hideMark/>
@@ -6025,7 +5702,6 @@
               <w:bottom w:val="nil"/>
               <w:right w:val="nil"/>
             </w:tcBorders>
-            <w:shd w:val="clear" w:color="auto" w:fill="auto"/>
             <w:noWrap/>
             <w:vAlign w:val="bottom"/>
             <w:hideMark/>
@@ -6067,7 +5743,6 @@
               <w:bottom w:val="nil"/>
               <w:right w:val="nil"/>
             </w:tcBorders>
-            <w:shd w:val="clear" w:color="auto" w:fill="auto"/>
             <w:noWrap/>
             <w:vAlign w:val="bottom"/>
             <w:hideMark/>
@@ -6109,7 +5784,6 @@
               <w:bottom w:val="nil"/>
               <w:right w:val="nil"/>
             </w:tcBorders>
-            <w:shd w:val="clear" w:color="auto" w:fill="auto"/>
             <w:noWrap/>
             <w:vAlign w:val="bottom"/>
             <w:hideMark/>
@@ -6151,7 +5825,6 @@
               <w:bottom w:val="nil"/>
               <w:right w:val="nil"/>
             </w:tcBorders>
-            <w:shd w:val="clear" w:color="auto" w:fill="auto"/>
             <w:noWrap/>
             <w:vAlign w:val="bottom"/>
             <w:hideMark/>
@@ -6244,7 +5917,6 @@
               <w:bottom w:val="nil"/>
               <w:right w:val="nil"/>
             </w:tcBorders>
-            <w:shd w:val="clear" w:color="auto" w:fill="auto"/>
             <w:noWrap/>
             <w:vAlign w:val="bottom"/>
             <w:hideMark/>
@@ -6286,7 +5958,6 @@
               <w:bottom w:val="nil"/>
               <w:right w:val="nil"/>
             </w:tcBorders>
-            <w:shd w:val="clear" w:color="auto" w:fill="auto"/>
             <w:noWrap/>
             <w:vAlign w:val="bottom"/>
             <w:hideMark/>
@@ -6334,7 +6005,6 @@
               <w:bottom w:val="nil"/>
               <w:right w:val="nil"/>
             </w:tcBorders>
-            <w:shd w:val="clear" w:color="auto" w:fill="auto"/>
             <w:noWrap/>
             <w:vAlign w:val="bottom"/>
             <w:hideMark/>
@@ -6376,7 +6046,6 @@
               <w:bottom w:val="nil"/>
               <w:right w:val="nil"/>
             </w:tcBorders>
-            <w:shd w:val="clear" w:color="auto" w:fill="auto"/>
             <w:noWrap/>
             <w:vAlign w:val="bottom"/>
             <w:hideMark/>
@@ -6424,7 +6093,6 @@
               <w:bottom w:val="nil"/>
               <w:right w:val="nil"/>
             </w:tcBorders>
-            <w:shd w:val="clear" w:color="auto" w:fill="auto"/>
             <w:noWrap/>
             <w:vAlign w:val="bottom"/>
             <w:hideMark/>
@@ -6466,7 +6134,6 @@
               <w:bottom w:val="nil"/>
               <w:right w:val="nil"/>
             </w:tcBorders>
-            <w:shd w:val="clear" w:color="auto" w:fill="auto"/>
             <w:noWrap/>
             <w:vAlign w:val="bottom"/>
             <w:hideMark/>
@@ -6514,7 +6181,6 @@
               <w:bottom w:val="nil"/>
               <w:right w:val="nil"/>
             </w:tcBorders>
-            <w:shd w:val="clear" w:color="auto" w:fill="auto"/>
             <w:noWrap/>
             <w:vAlign w:val="bottom"/>
             <w:hideMark/>
@@ -6557,7 +6223,6 @@
               <w:bottom w:val="nil"/>
               <w:right w:val="nil"/>
             </w:tcBorders>
-            <w:shd w:val="clear" w:color="auto" w:fill="auto"/>
             <w:noWrap/>
             <w:vAlign w:val="bottom"/>
             <w:hideMark/>
@@ -6775,7 +6440,6 @@
               <w:bottom w:val="nil"/>
               <w:right w:val="nil"/>
             </w:tcBorders>
-            <w:shd w:val="clear" w:color="auto" w:fill="auto"/>
             <w:noWrap/>
             <w:vAlign w:val="bottom"/>
             <w:hideMark/>
@@ -6817,7 +6481,6 @@
               <w:bottom w:val="nil"/>
               <w:right w:val="nil"/>
             </w:tcBorders>
-            <w:shd w:val="clear" w:color="auto" w:fill="auto"/>
             <w:noWrap/>
             <w:vAlign w:val="bottom"/>
             <w:hideMark/>
@@ -6859,7 +6522,6 @@
               <w:bottom w:val="nil"/>
               <w:right w:val="nil"/>
             </w:tcBorders>
-            <w:shd w:val="clear" w:color="auto" w:fill="auto"/>
             <w:noWrap/>
             <w:vAlign w:val="bottom"/>
             <w:hideMark/>
@@ -6901,7 +6563,6 @@
               <w:bottom w:val="nil"/>
               <w:right w:val="nil"/>
             </w:tcBorders>
-            <w:shd w:val="clear" w:color="auto" w:fill="auto"/>
             <w:noWrap/>
             <w:vAlign w:val="bottom"/>
             <w:hideMark/>
@@ -6949,7 +6610,6 @@
               <w:bottom w:val="nil"/>
               <w:right w:val="nil"/>
             </w:tcBorders>
-            <w:shd w:val="clear" w:color="auto" w:fill="auto"/>
             <w:noWrap/>
             <w:vAlign w:val="bottom"/>
             <w:hideMark/>
@@ -6991,7 +6651,6 @@
               <w:bottom w:val="nil"/>
               <w:right w:val="nil"/>
             </w:tcBorders>
-            <w:shd w:val="clear" w:color="auto" w:fill="auto"/>
             <w:noWrap/>
             <w:vAlign w:val="bottom"/>
             <w:hideMark/>
@@ -7033,7 +6692,6 @@
               <w:bottom w:val="nil"/>
               <w:right w:val="nil"/>
             </w:tcBorders>
-            <w:shd w:val="clear" w:color="auto" w:fill="auto"/>
             <w:noWrap/>
             <w:vAlign w:val="bottom"/>
             <w:hideMark/>
@@ -7075,7 +6733,6 @@
               <w:bottom w:val="nil"/>
               <w:right w:val="nil"/>
             </w:tcBorders>
-            <w:shd w:val="clear" w:color="auto" w:fill="auto"/>
             <w:noWrap/>
             <w:vAlign w:val="bottom"/>
             <w:hideMark/>
@@ -7123,7 +6780,6 @@
               <w:bottom w:val="nil"/>
               <w:right w:val="nil"/>
             </w:tcBorders>
-            <w:shd w:val="clear" w:color="auto" w:fill="auto"/>
             <w:noWrap/>
             <w:vAlign w:val="bottom"/>
             <w:hideMark/>
@@ -7165,7 +6821,6 @@
               <w:bottom w:val="nil"/>
               <w:right w:val="nil"/>
             </w:tcBorders>
-            <w:shd w:val="clear" w:color="auto" w:fill="auto"/>
             <w:noWrap/>
             <w:vAlign w:val="bottom"/>
             <w:hideMark/>
@@ -7207,7 +6862,6 @@
               <w:bottom w:val="nil"/>
               <w:right w:val="nil"/>
             </w:tcBorders>
-            <w:shd w:val="clear" w:color="auto" w:fill="auto"/>
             <w:noWrap/>
             <w:vAlign w:val="bottom"/>
             <w:hideMark/>
@@ -7249,7 +6903,6 @@
               <w:bottom w:val="nil"/>
               <w:right w:val="nil"/>
             </w:tcBorders>
-            <w:shd w:val="clear" w:color="auto" w:fill="auto"/>
             <w:noWrap/>
             <w:vAlign w:val="bottom"/>
             <w:hideMark/>
@@ -7597,7 +7250,6 @@
               <w:bottom w:val="nil"/>
               <w:right w:val="nil"/>
             </w:tcBorders>
-            <w:shd w:val="clear" w:color="auto" w:fill="auto"/>
             <w:noWrap/>
             <w:vAlign w:val="bottom"/>
             <w:hideMark/>
@@ -7663,7 +7315,6 @@
               <w:bottom w:val="nil"/>
               <w:right w:val="nil"/>
             </w:tcBorders>
-            <w:shd w:val="clear" w:color="auto" w:fill="auto"/>
             <w:noWrap/>
             <w:vAlign w:val="bottom"/>
             <w:hideMark/>
@@ -7711,7 +7362,6 @@
               <w:bottom w:val="nil"/>
               <w:right w:val="nil"/>
             </w:tcBorders>
-            <w:shd w:val="clear" w:color="auto" w:fill="auto"/>
             <w:noWrap/>
             <w:vAlign w:val="bottom"/>
             <w:hideMark/>
@@ -7777,7 +7427,6 @@
               <w:bottom w:val="nil"/>
               <w:right w:val="nil"/>
             </w:tcBorders>
-            <w:shd w:val="clear" w:color="auto" w:fill="auto"/>
             <w:noWrap/>
             <w:vAlign w:val="bottom"/>
             <w:hideMark/>
@@ -7825,7 +7474,6 @@
               <w:bottom w:val="nil"/>
               <w:right w:val="nil"/>
             </w:tcBorders>
-            <w:shd w:val="clear" w:color="auto" w:fill="auto"/>
             <w:noWrap/>
             <w:vAlign w:val="bottom"/>
             <w:hideMark/>
@@ -7891,7 +7539,6 @@
               <w:bottom w:val="nil"/>
               <w:right w:val="nil"/>
             </w:tcBorders>
-            <w:shd w:val="clear" w:color="auto" w:fill="auto"/>
             <w:noWrap/>
             <w:vAlign w:val="bottom"/>
             <w:hideMark/>
@@ -7939,7 +7586,6 @@
               <w:bottom w:val="nil"/>
               <w:right w:val="nil"/>
             </w:tcBorders>
-            <w:shd w:val="clear" w:color="auto" w:fill="auto"/>
             <w:noWrap/>
             <w:vAlign w:val="bottom"/>
             <w:hideMark/>
@@ -8005,7 +7651,6 @@
               <w:bottom w:val="nil"/>
               <w:right w:val="nil"/>
             </w:tcBorders>
-            <w:shd w:val="clear" w:color="auto" w:fill="auto"/>
             <w:noWrap/>
             <w:vAlign w:val="bottom"/>
             <w:hideMark/>
@@ -8053,7 +7698,6 @@
               <w:bottom w:val="nil"/>
               <w:right w:val="nil"/>
             </w:tcBorders>
-            <w:shd w:val="clear" w:color="auto" w:fill="auto"/>
             <w:noWrap/>
             <w:vAlign w:val="bottom"/>
           </w:tcPr>
@@ -8082,7 +7726,6 @@
               <w:bottom w:val="nil"/>
               <w:right w:val="nil"/>
             </w:tcBorders>
-            <w:shd w:val="clear" w:color="auto" w:fill="auto"/>
             <w:noWrap/>
             <w:vAlign w:val="bottom"/>
           </w:tcPr>
@@ -8154,7 +7797,6 @@
               <w:bottom w:val="nil"/>
               <w:right w:val="nil"/>
             </w:tcBorders>
-            <w:shd w:val="clear" w:color="auto" w:fill="auto"/>
             <w:noWrap/>
             <w:vAlign w:val="bottom"/>
             <w:hideMark/>
@@ -8220,7 +7862,6 @@
               <w:bottom w:val="nil"/>
               <w:right w:val="nil"/>
             </w:tcBorders>
-            <w:shd w:val="clear" w:color="auto" w:fill="auto"/>
             <w:noWrap/>
             <w:vAlign w:val="bottom"/>
             <w:hideMark/>
@@ -8268,7 +7909,6 @@
               <w:bottom w:val="nil"/>
               <w:right w:val="nil"/>
             </w:tcBorders>
-            <w:shd w:val="clear" w:color="auto" w:fill="auto"/>
             <w:noWrap/>
             <w:vAlign w:val="bottom"/>
             <w:hideMark/>
@@ -8334,7 +7974,6 @@
               <w:bottom w:val="nil"/>
               <w:right w:val="nil"/>
             </w:tcBorders>
-            <w:shd w:val="clear" w:color="auto" w:fill="auto"/>
             <w:noWrap/>
             <w:vAlign w:val="bottom"/>
             <w:hideMark/>
@@ -8382,7 +8021,6 @@
               <w:bottom w:val="nil"/>
               <w:right w:val="nil"/>
             </w:tcBorders>
-            <w:shd w:val="clear" w:color="auto" w:fill="auto"/>
             <w:noWrap/>
             <w:vAlign w:val="bottom"/>
             <w:hideMark/>
@@ -8448,7 +8086,6 @@
               <w:bottom w:val="nil"/>
               <w:right w:val="nil"/>
             </w:tcBorders>
-            <w:shd w:val="clear" w:color="auto" w:fill="auto"/>
             <w:noWrap/>
             <w:vAlign w:val="bottom"/>
             <w:hideMark/>
@@ -8496,7 +8133,6 @@
               <w:bottom w:val="nil"/>
               <w:right w:val="nil"/>
             </w:tcBorders>
-            <w:shd w:val="clear" w:color="auto" w:fill="auto"/>
             <w:noWrap/>
             <w:vAlign w:val="bottom"/>
             <w:hideMark/>
@@ -8562,7 +8198,6 @@
               <w:bottom w:val="nil"/>
               <w:right w:val="nil"/>
             </w:tcBorders>
-            <w:shd w:val="clear" w:color="auto" w:fill="auto"/>
             <w:noWrap/>
             <w:vAlign w:val="bottom"/>
             <w:hideMark/>
@@ -8610,7 +8245,6 @@
               <w:bottom w:val="nil"/>
               <w:right w:val="nil"/>
             </w:tcBorders>
-            <w:shd w:val="clear" w:color="auto" w:fill="auto"/>
             <w:noWrap/>
             <w:vAlign w:val="bottom"/>
           </w:tcPr>
@@ -8635,7 +8269,6 @@
               <w:bottom w:val="nil"/>
               <w:right w:val="nil"/>
             </w:tcBorders>
-            <w:shd w:val="clear" w:color="auto" w:fill="auto"/>
             <w:noWrap/>
             <w:vAlign w:val="bottom"/>
           </w:tcPr>
@@ -8775,7 +8408,6 @@
               <w:bottom w:val="nil"/>
               <w:right w:val="nil"/>
             </w:tcBorders>
-            <w:shd w:val="clear" w:color="auto" w:fill="auto"/>
             <w:noWrap/>
             <w:vAlign w:val="bottom"/>
             <w:hideMark/>
@@ -8886,7 +8518,6 @@
               <w:bottom w:val="nil"/>
               <w:right w:val="nil"/>
             </w:tcBorders>
-            <w:shd w:val="clear" w:color="auto" w:fill="auto"/>
             <w:noWrap/>
             <w:vAlign w:val="bottom"/>
             <w:hideMark/>
@@ -8997,7 +8628,6 @@
               <w:bottom w:val="nil"/>
               <w:right w:val="nil"/>
             </w:tcBorders>
-            <w:shd w:val="clear" w:color="auto" w:fill="auto"/>
             <w:noWrap/>
             <w:vAlign w:val="bottom"/>
             <w:hideMark/>
@@ -9108,7 +8738,6 @@
               <w:bottom w:val="nil"/>
               <w:right w:val="nil"/>
             </w:tcBorders>
-            <w:shd w:val="clear" w:color="auto" w:fill="auto"/>
             <w:noWrap/>
             <w:vAlign w:val="bottom"/>
             <w:hideMark/>
@@ -9240,7 +8869,6 @@
               <w:bottom w:val="nil"/>
               <w:right w:val="nil"/>
             </w:tcBorders>
-            <w:shd w:val="clear" w:color="auto" w:fill="auto"/>
             <w:noWrap/>
             <w:vAlign w:val="bottom"/>
             <w:hideMark/>
@@ -9351,7 +8979,6 @@
               <w:bottom w:val="nil"/>
               <w:right w:val="nil"/>
             </w:tcBorders>
-            <w:shd w:val="clear" w:color="auto" w:fill="auto"/>
             <w:noWrap/>
             <w:vAlign w:val="bottom"/>
             <w:hideMark/>
@@ -9462,7 +9089,6 @@
               <w:bottom w:val="nil"/>
               <w:right w:val="nil"/>
             </w:tcBorders>
-            <w:shd w:val="clear" w:color="auto" w:fill="auto"/>
             <w:noWrap/>
             <w:vAlign w:val="bottom"/>
             <w:hideMark/>
@@ -9573,7 +9199,6 @@
               <w:bottom w:val="nil"/>
               <w:right w:val="nil"/>
             </w:tcBorders>
-            <w:shd w:val="clear" w:color="auto" w:fill="auto"/>
             <w:noWrap/>
             <w:vAlign w:val="bottom"/>
             <w:hideMark/>
@@ -9705,7 +9330,6 @@
               <w:bottom w:val="nil"/>
               <w:right w:val="nil"/>
             </w:tcBorders>
-            <w:shd w:val="clear" w:color="auto" w:fill="auto"/>
             <w:noWrap/>
             <w:vAlign w:val="bottom"/>
             <w:hideMark/>
@@ -9816,7 +9440,6 @@
               <w:bottom w:val="nil"/>
               <w:right w:val="nil"/>
             </w:tcBorders>
-            <w:shd w:val="clear" w:color="auto" w:fill="auto"/>
             <w:noWrap/>
             <w:vAlign w:val="bottom"/>
             <w:hideMark/>
@@ -9927,7 +9550,6 @@
               <w:bottom w:val="nil"/>
               <w:right w:val="nil"/>
             </w:tcBorders>
-            <w:shd w:val="clear" w:color="auto" w:fill="auto"/>
             <w:noWrap/>
             <w:vAlign w:val="bottom"/>
             <w:hideMark/>
@@ -10038,7 +9660,6 @@
               <w:bottom w:val="nil"/>
               <w:right w:val="nil"/>
             </w:tcBorders>
-            <w:shd w:val="clear" w:color="auto" w:fill="auto"/>
             <w:noWrap/>
             <w:vAlign w:val="bottom"/>
             <w:hideMark/>
@@ -10146,7 +9767,6 @@
               <w:bottom w:val="nil"/>
               <w:right w:val="nil"/>
             </w:tcBorders>
-            <w:shd w:val="clear" w:color="auto" w:fill="auto"/>
             <w:noWrap/>
             <w:vAlign w:val="bottom"/>
             <w:hideMark/>
@@ -10188,7 +9808,6 @@
               <w:bottom w:val="nil"/>
               <w:right w:val="nil"/>
             </w:tcBorders>
-            <w:shd w:val="clear" w:color="auto" w:fill="auto"/>
             <w:noWrap/>
             <w:vAlign w:val="bottom"/>
             <w:hideMark/>
@@ -10230,7 +9849,6 @@
               <w:bottom w:val="nil"/>
               <w:right w:val="nil"/>
             </w:tcBorders>
-            <w:shd w:val="clear" w:color="auto" w:fill="auto"/>
             <w:noWrap/>
             <w:vAlign w:val="bottom"/>
             <w:hideMark/>
@@ -10272,7 +9890,6 @@
               <w:bottom w:val="nil"/>
               <w:right w:val="nil"/>
             </w:tcBorders>
-            <w:shd w:val="clear" w:color="auto" w:fill="auto"/>
             <w:noWrap/>
             <w:vAlign w:val="bottom"/>
             <w:hideMark/>
@@ -10320,7 +9937,6 @@
               <w:bottom w:val="nil"/>
               <w:right w:val="nil"/>
             </w:tcBorders>
-            <w:shd w:val="clear" w:color="auto" w:fill="auto"/>
             <w:noWrap/>
             <w:vAlign w:val="bottom"/>
             <w:hideMark/>
@@ -10362,7 +9978,6 @@
               <w:bottom w:val="nil"/>
               <w:right w:val="nil"/>
             </w:tcBorders>
-            <w:shd w:val="clear" w:color="auto" w:fill="auto"/>
             <w:noWrap/>
             <w:vAlign w:val="bottom"/>
             <w:hideMark/>
@@ -10404,7 +10019,6 @@
               <w:bottom w:val="nil"/>
               <w:right w:val="nil"/>
             </w:tcBorders>
-            <w:shd w:val="clear" w:color="auto" w:fill="auto"/>
             <w:noWrap/>
             <w:vAlign w:val="bottom"/>
             <w:hideMark/>
@@ -10446,7 +10060,6 @@
               <w:bottom w:val="nil"/>
               <w:right w:val="nil"/>
             </w:tcBorders>
-            <w:shd w:val="clear" w:color="auto" w:fill="auto"/>
             <w:noWrap/>
             <w:vAlign w:val="bottom"/>
             <w:hideMark/>
@@ -10494,7 +10107,6 @@
               <w:bottom w:val="nil"/>
               <w:right w:val="nil"/>
             </w:tcBorders>
-            <w:shd w:val="clear" w:color="auto" w:fill="auto"/>
             <w:noWrap/>
             <w:vAlign w:val="bottom"/>
             <w:hideMark/>
@@ -10536,7 +10148,6 @@
               <w:bottom w:val="nil"/>
               <w:right w:val="nil"/>
             </w:tcBorders>
-            <w:shd w:val="clear" w:color="auto" w:fill="auto"/>
             <w:noWrap/>
             <w:vAlign w:val="bottom"/>
             <w:hideMark/>
@@ -10578,7 +10189,6 @@
               <w:bottom w:val="nil"/>
               <w:right w:val="nil"/>
             </w:tcBorders>
-            <w:shd w:val="clear" w:color="auto" w:fill="auto"/>
             <w:noWrap/>
             <w:vAlign w:val="bottom"/>
             <w:hideMark/>
@@ -10620,7 +10230,6 @@
               <w:bottom w:val="nil"/>
               <w:right w:val="nil"/>
             </w:tcBorders>
-            <w:shd w:val="clear" w:color="auto" w:fill="auto"/>
             <w:noWrap/>
             <w:vAlign w:val="bottom"/>
             <w:hideMark/>
@@ -10668,7 +10277,6 @@
               <w:bottom w:val="nil"/>
               <w:right w:val="nil"/>
             </w:tcBorders>
-            <w:shd w:val="clear" w:color="auto" w:fill="auto"/>
             <w:noWrap/>
             <w:vAlign w:val="bottom"/>
             <w:hideMark/>
@@ -10710,7 +10318,6 @@
               <w:bottom w:val="nil"/>
               <w:right w:val="nil"/>
             </w:tcBorders>
-            <w:shd w:val="clear" w:color="auto" w:fill="auto"/>
             <w:noWrap/>
             <w:vAlign w:val="bottom"/>
             <w:hideMark/>
@@ -10752,7 +10359,6 @@
               <w:bottom w:val="nil"/>
               <w:right w:val="nil"/>
             </w:tcBorders>
-            <w:shd w:val="clear" w:color="auto" w:fill="auto"/>
             <w:noWrap/>
             <w:vAlign w:val="bottom"/>
             <w:hideMark/>
@@ -10794,7 +10400,6 @@
               <w:bottom w:val="nil"/>
               <w:right w:val="nil"/>
             </w:tcBorders>
-            <w:shd w:val="clear" w:color="auto" w:fill="auto"/>
             <w:noWrap/>
             <w:vAlign w:val="bottom"/>
             <w:hideMark/>
@@ -11071,7 +10676,6 @@
                 <w14:ligatures w14:val="none"/>
               </w:rPr>
             </w:pPr>
-            <w:proofErr w:type="spellStart"/>
             <w:r>
               <w:rPr>
                 <w:rFonts w:ascii="Times New Roman" w:hAnsi="Times New Roman" w:cs="Times New Roman"/>
@@ -11081,7 +10685,6 @@
               </w:rPr>
               <w:t>Australia</w:t>
             </w:r>
-            <w:proofErr w:type="spellEnd"/>
           </w:p>
         </w:tc>
         <w:tc>
@@ -11406,7 +11009,6 @@
                 <w14:ligatures w14:val="none"/>
               </w:rPr>
             </w:pPr>
-            <w:proofErr w:type="spellStart"/>
             <w:r>
               <w:rPr>
                 <w:rFonts w:ascii="Times New Roman" w:hAnsi="Times New Roman" w:cs="Times New Roman"/>
@@ -11416,7 +11018,6 @@
               </w:rPr>
               <w:t>Denmark</w:t>
             </w:r>
-            <w:proofErr w:type="spellEnd"/>
           </w:p>
         </w:tc>
         <w:tc>
@@ -11741,7 +11342,6 @@
                 <w14:ligatures w14:val="none"/>
               </w:rPr>
             </w:pPr>
-            <w:proofErr w:type="spellStart"/>
             <w:r>
               <w:rPr>
                 <w:rFonts w:ascii="Times New Roman" w:hAnsi="Times New Roman" w:cs="Times New Roman"/>
@@ -11751,7 +11351,6 @@
               </w:rPr>
               <w:t>Germany</w:t>
             </w:r>
-            <w:proofErr w:type="spellEnd"/>
           </w:p>
         </w:tc>
         <w:tc>
@@ -11909,7 +11508,6 @@
                 <w14:ligatures w14:val="none"/>
               </w:rPr>
             </w:pPr>
-            <w:proofErr w:type="spellStart"/>
             <w:r>
               <w:rPr>
                 <w:rFonts w:ascii="Times New Roman" w:hAnsi="Times New Roman" w:cs="Times New Roman"/>
@@ -11919,7 +11517,6 @@
               </w:rPr>
               <w:t>Netherlands</w:t>
             </w:r>
-            <w:proofErr w:type="spellEnd"/>
           </w:p>
         </w:tc>
         <w:tc>
@@ -12078,7 +11675,6 @@
                 <w14:ligatures w14:val="none"/>
               </w:rPr>
             </w:pPr>
-            <w:proofErr w:type="spellStart"/>
             <w:r>
               <w:rPr>
                 <w:rFonts w:ascii="Times New Roman" w:hAnsi="Times New Roman" w:cs="Times New Roman"/>
@@ -12088,7 +11684,6 @@
               </w:rPr>
               <w:t>Norway</w:t>
             </w:r>
-            <w:proofErr w:type="spellEnd"/>
           </w:p>
         </w:tc>
         <w:tc>
@@ -12246,7 +11841,6 @@
                 <w14:ligatures w14:val="none"/>
               </w:rPr>
             </w:pPr>
-            <w:proofErr w:type="spellStart"/>
             <w:r>
               <w:rPr>
                 <w:rFonts w:ascii="Times New Roman" w:hAnsi="Times New Roman" w:cs="Times New Roman"/>
@@ -12256,7 +11850,6 @@
               </w:rPr>
               <w:t>Switzerland</w:t>
             </w:r>
-            <w:proofErr w:type="spellEnd"/>
           </w:p>
         </w:tc>
         <w:tc>
@@ -12422,19 +12015,8 @@
                 <w:sz w:val="24"/>
                 <w:szCs w:val="24"/>
               </w:rPr>
-              <w:t xml:space="preserve">United </w:t>
-            </w:r>
-            <w:proofErr w:type="spellStart"/>
-            <w:r>
-              <w:rPr>
-                <w:rFonts w:ascii="Times New Roman" w:hAnsi="Times New Roman" w:cs="Times New Roman"/>
-                <w:color w:val="000000"/>
-                <w:sz w:val="24"/>
-                <w:szCs w:val="24"/>
-              </w:rPr>
-              <w:t>Kingdom</w:t>
-            </w:r>
-            <w:proofErr w:type="spellEnd"/>
+              <w:t>United Kingdom</w:t>
+            </w:r>
           </w:p>
         </w:tc>
         <w:tc>
@@ -12599,19 +12181,8 @@
                 <w:sz w:val="24"/>
                 <w:szCs w:val="24"/>
               </w:rPr>
-              <w:t xml:space="preserve">United </w:t>
-            </w:r>
-            <w:proofErr w:type="spellStart"/>
-            <w:r>
-              <w:rPr>
-                <w:rFonts w:ascii="Times New Roman" w:hAnsi="Times New Roman" w:cs="Times New Roman"/>
-                <w:color w:val="000000"/>
-                <w:sz w:val="24"/>
-                <w:szCs w:val="24"/>
-              </w:rPr>
-              <w:t>States</w:t>
-            </w:r>
-            <w:proofErr w:type="spellEnd"/>
+              <w:t>United States</w:t>
+            </w:r>
           </w:p>
         </w:tc>
         <w:tc>
@@ -13662,7 +13233,7 @@
 </file>
 
 <file path=word/endnotes.xml><?xml version="1.0" encoding="utf-8"?>
-<w:endnotes xmlns:wpc="http://schemas.microsoft.com/office/word/2010/wordprocessingCanvas" xmlns:cx="http://schemas.microsoft.com/office/drawing/2014/chartex" xmlns:cx1="http://schemas.microsoft.com/office/drawing/2015/9/8/chartex" xmlns:cx2="http://schemas.microsoft.com/office/drawing/2015/10/21/chartex" xmlns:cx3="http://schemas.microsoft.com/office/drawing/2016/5/9/chartex" xmlns:cx4="http://schemas.microsoft.com/office/drawing/2016/5/10/chartex" xmlns:cx5="http://schemas.microsoft.com/office/drawing/2016/5/11/chartex" xmlns:cx6="http://schemas.microsoft.com/office/drawing/2016/5/12/chartex" xmlns:cx7="http://schemas.microsoft.com/office/drawing/2016/5/13/chartex" xmlns:cx8="http://schemas.microsoft.com/office/drawing/2016/5/14/chartex" xmlns:mc="http://schemas.openxmlformats.org/markup-compatibility/2006" xmlns:aink="http://schemas.microsoft.com/office/drawing/2016/ink" xmlns:am3d="http://schemas.microsoft.com/office/drawing/2017/model3d" xmlns:o="urn:schemas-microsoft-com:office:office" xmlns:r="http://schemas.openxmlformats.org/officeDocument/2006/relationships" xmlns:m="http://schemas.openxmlformats.org/officeDocument/2006/math" xmlns:v="urn:schemas-microsoft-com:vml" xmlns:wp14="http://schemas.microsoft.com/office/word/2010/wordprocessingDrawing" xmlns:wp="http://schemas.openxmlformats.org/drawingml/2006/wordprocessingDrawing" xmlns:w10="urn:schemas-microsoft-com:office:word" xmlns:w="http://schemas.openxmlformats.org/wordprocessingml/2006/main" xmlns:w14="http://schemas.microsoft.com/office/word/2010/wordml" xmlns:w15="http://schemas.microsoft.com/office/word/2012/wordml" xmlns:w16cex="http://schemas.microsoft.com/office/word/2018/wordml/cex" xmlns:w16cid="http://schemas.microsoft.com/office/word/2016/wordml/cid" xmlns:w16="http://schemas.microsoft.com/office/word/2018/wordml" xmlns:w16sdtdh="http://schemas.microsoft.com/office/word/2020/wordml/sdtdatahash" xmlns:w16se="http://schemas.microsoft.com/office/word/2015/wordml/symex" xmlns:wpg="http://schemas.microsoft.com/office/word/2010/wordprocessingGroup" xmlns:wpi="http://schemas.microsoft.com/office/word/2010/wordprocessingInk" xmlns:wne="http://schemas.microsoft.com/office/word/2006/wordml" xmlns:wps="http://schemas.microsoft.com/office/word/2010/wordprocessingShape" mc:Ignorable="w14 w15 w16se w16cid w16 w16cex w16sdtdh wp14">
+<w:endnotes xmlns:wpc="http://schemas.microsoft.com/office/word/2010/wordprocessingCanvas" xmlns:cx="http://schemas.microsoft.com/office/drawing/2014/chartex" xmlns:cx1="http://schemas.microsoft.com/office/drawing/2015/9/8/chartex" xmlns:cx2="http://schemas.microsoft.com/office/drawing/2015/10/21/chartex" xmlns:cx3="http://schemas.microsoft.com/office/drawing/2016/5/9/chartex" xmlns:cx4="http://schemas.microsoft.com/office/drawing/2016/5/10/chartex" xmlns:cx5="http://schemas.microsoft.com/office/drawing/2016/5/11/chartex" xmlns:cx6="http://schemas.microsoft.com/office/drawing/2016/5/12/chartex" xmlns:cx7="http://schemas.microsoft.com/office/drawing/2016/5/13/chartex" xmlns:cx8="http://schemas.microsoft.com/office/drawing/2016/5/14/chartex" xmlns:mc="http://schemas.openxmlformats.org/markup-compatibility/2006" xmlns:aink="http://schemas.microsoft.com/office/drawing/2016/ink" xmlns:am3d="http://schemas.microsoft.com/office/drawing/2017/model3d" xmlns:o="urn:schemas-microsoft-com:office:office" xmlns:oel="http://schemas.microsoft.com/office/2019/extlst" xmlns:r="http://schemas.openxmlformats.org/officeDocument/2006/relationships" xmlns:m="http://schemas.openxmlformats.org/officeDocument/2006/math" xmlns:v="urn:schemas-microsoft-com:vml" xmlns:wp14="http://schemas.microsoft.com/office/word/2010/wordprocessingDrawing" xmlns:wp="http://schemas.openxmlformats.org/drawingml/2006/wordprocessingDrawing" xmlns:w10="urn:schemas-microsoft-com:office:word" xmlns:w="http://schemas.openxmlformats.org/wordprocessingml/2006/main" xmlns:w14="http://schemas.microsoft.com/office/word/2010/wordml" xmlns:w15="http://schemas.microsoft.com/office/word/2012/wordml" xmlns:w16cex="http://schemas.microsoft.com/office/word/2018/wordml/cex" xmlns:w16cid="http://schemas.microsoft.com/office/word/2016/wordml/cid" xmlns:w16="http://schemas.microsoft.com/office/word/2018/wordml" xmlns:w16du="http://schemas.microsoft.com/office/word/2023/wordml/word16du" xmlns:w16sdtdh="http://schemas.microsoft.com/office/word/2020/wordml/sdtdatahash" xmlns:w16sdtfl="http://schemas.microsoft.com/office/word/2024/wordml/sdtformatlock" xmlns:w16se="http://schemas.microsoft.com/office/word/2015/wordml/symex" xmlns:wpg="http://schemas.microsoft.com/office/word/2010/wordprocessingGroup" xmlns:wpi="http://schemas.microsoft.com/office/word/2010/wordprocessingInk" xmlns:wne="http://schemas.microsoft.com/office/word/2006/wordml" xmlns:wps="http://schemas.microsoft.com/office/word/2010/wordprocessingShape" mc:Ignorable="w14 w15 w16se w16cid w16 w16cex w16sdtdh w16sdtfl w16du wp14">
   <w:endnote w:type="separator" w:id="-1">
     <w:p>
       <w:pPr>
@@ -13687,7 +13258,7 @@
 </file>
 
 <file path=word/footer1.xml><?xml version="1.0" encoding="utf-8"?>
-<w:ftr xmlns:wpc="http://schemas.microsoft.com/office/word/2010/wordprocessingCanvas" xmlns:cx="http://schemas.microsoft.com/office/drawing/2014/chartex" xmlns:cx1="http://schemas.microsoft.com/office/drawing/2015/9/8/chartex" xmlns:cx2="http://schemas.microsoft.com/office/drawing/2015/10/21/chartex" xmlns:cx3="http://schemas.microsoft.com/office/drawing/2016/5/9/chartex" xmlns:cx4="http://schemas.microsoft.com/office/drawing/2016/5/10/chartex" xmlns:cx5="http://schemas.microsoft.com/office/drawing/2016/5/11/chartex" xmlns:cx6="http://schemas.microsoft.com/office/drawing/2016/5/12/chartex" xmlns:cx7="http://schemas.microsoft.com/office/drawing/2016/5/13/chartex" xmlns:cx8="http://schemas.microsoft.com/office/drawing/2016/5/14/chartex" xmlns:mc="http://schemas.openxmlformats.org/markup-compatibility/2006" xmlns:aink="http://schemas.microsoft.com/office/drawing/2016/ink" xmlns:am3d="http://schemas.microsoft.com/office/drawing/2017/model3d" xmlns:o="urn:schemas-microsoft-com:office:office" xmlns:r="http://schemas.openxmlformats.org/officeDocument/2006/relationships" xmlns:m="http://schemas.openxmlformats.org/officeDocument/2006/math" xmlns:v="urn:schemas-microsoft-com:vml" xmlns:wp14="http://schemas.microsoft.com/office/word/2010/wordprocessingDrawing" xmlns:wp="http://schemas.openxmlformats.org/drawingml/2006/wordprocessingDrawing" xmlns:w10="urn:schemas-microsoft-com:office:word" xmlns:w="http://schemas.openxmlformats.org/wordprocessingml/2006/main" xmlns:w14="http://schemas.microsoft.com/office/word/2010/wordml" xmlns:w15="http://schemas.microsoft.com/office/word/2012/wordml" xmlns:w16cex="http://schemas.microsoft.com/office/word/2018/wordml/cex" xmlns:w16cid="http://schemas.microsoft.com/office/word/2016/wordml/cid" xmlns:w16="http://schemas.microsoft.com/office/word/2018/wordml" xmlns:w16sdtdh="http://schemas.microsoft.com/office/word/2020/wordml/sdtdatahash" xmlns:w16se="http://schemas.microsoft.com/office/word/2015/wordml/symex" xmlns:wpg="http://schemas.microsoft.com/office/word/2010/wordprocessingGroup" xmlns:wpi="http://schemas.microsoft.com/office/word/2010/wordprocessingInk" xmlns:wne="http://schemas.microsoft.com/office/word/2006/wordml" xmlns:wps="http://schemas.microsoft.com/office/word/2010/wordprocessingShape" mc:Ignorable="w14 w15 w16se w16cid w16 w16cex w16sdtdh wp14">
+<w:ftr xmlns:wpc="http://schemas.microsoft.com/office/word/2010/wordprocessingCanvas" xmlns:cx="http://schemas.microsoft.com/office/drawing/2014/chartex" xmlns:cx1="http://schemas.microsoft.com/office/drawing/2015/9/8/chartex" xmlns:cx2="http://schemas.microsoft.com/office/drawing/2015/10/21/chartex" xmlns:cx3="http://schemas.microsoft.com/office/drawing/2016/5/9/chartex" xmlns:cx4="http://schemas.microsoft.com/office/drawing/2016/5/10/chartex" xmlns:cx5="http://schemas.microsoft.com/office/drawing/2016/5/11/chartex" xmlns:cx6="http://schemas.microsoft.com/office/drawing/2016/5/12/chartex" xmlns:cx7="http://schemas.microsoft.com/office/drawing/2016/5/13/chartex" xmlns:cx8="http://schemas.microsoft.com/office/drawing/2016/5/14/chartex" xmlns:mc="http://schemas.openxmlformats.org/markup-compatibility/2006" xmlns:aink="http://schemas.microsoft.com/office/drawing/2016/ink" xmlns:am3d="http://schemas.microsoft.com/office/drawing/2017/model3d" xmlns:o="urn:schemas-microsoft-com:office:office" xmlns:oel="http://schemas.microsoft.com/office/2019/extlst" xmlns:r="http://schemas.openxmlformats.org/officeDocument/2006/relationships" xmlns:m="http://schemas.openxmlformats.org/officeDocument/2006/math" xmlns:v="urn:schemas-microsoft-com:vml" xmlns:wp14="http://schemas.microsoft.com/office/word/2010/wordprocessingDrawing" xmlns:wp="http://schemas.openxmlformats.org/drawingml/2006/wordprocessingDrawing" xmlns:w10="urn:schemas-microsoft-com:office:word" xmlns:w="http://schemas.openxmlformats.org/wordprocessingml/2006/main" xmlns:w14="http://schemas.microsoft.com/office/word/2010/wordml" xmlns:w15="http://schemas.microsoft.com/office/word/2012/wordml" xmlns:w16cex="http://schemas.microsoft.com/office/word/2018/wordml/cex" xmlns:w16cid="http://schemas.microsoft.com/office/word/2016/wordml/cid" xmlns:w16="http://schemas.microsoft.com/office/word/2018/wordml" xmlns:w16du="http://schemas.microsoft.com/office/word/2023/wordml/word16du" xmlns:w16sdtdh="http://schemas.microsoft.com/office/word/2020/wordml/sdtdatahash" xmlns:w16sdtfl="http://schemas.microsoft.com/office/word/2024/wordml/sdtformatlock" xmlns:w16se="http://schemas.microsoft.com/office/word/2015/wordml/symex" xmlns:wpg="http://schemas.microsoft.com/office/word/2010/wordprocessingGroup" xmlns:wpi="http://schemas.microsoft.com/office/word/2010/wordprocessingInk" xmlns:wne="http://schemas.microsoft.com/office/word/2006/wordml" xmlns:wps="http://schemas.microsoft.com/office/word/2010/wordprocessingShape" mc:Ignorable="w14 w15 w16se w16cid w16 w16cex w16sdtdh w16sdtfl w16du wp14">
   <w:sdt>
     <w:sdtPr>
       <w:id w:val="89819927"/>
@@ -13729,7 +13300,7 @@
 </file>
 
 <file path=word/footnotes.xml><?xml version="1.0" encoding="utf-8"?>
-<w:footnotes xmlns:wpc="http://schemas.microsoft.com/office/word/2010/wordprocessingCanvas" xmlns:cx="http://schemas.microsoft.com/office/drawing/2014/chartex" xmlns:cx1="http://schemas.microsoft.com/office/drawing/2015/9/8/chartex" xmlns:cx2="http://schemas.microsoft.com/office/drawing/2015/10/21/chartex" xmlns:cx3="http://schemas.microsoft.com/office/drawing/2016/5/9/chartex" xmlns:cx4="http://schemas.microsoft.com/office/drawing/2016/5/10/chartex" xmlns:cx5="http://schemas.microsoft.com/office/drawing/2016/5/11/chartex" xmlns:cx6="http://schemas.microsoft.com/office/drawing/2016/5/12/chartex" xmlns:cx7="http://schemas.microsoft.com/office/drawing/2016/5/13/chartex" xmlns:cx8="http://schemas.microsoft.com/office/drawing/2016/5/14/chartex" xmlns:mc="http://schemas.openxmlformats.org/markup-compatibility/2006" xmlns:aink="http://schemas.microsoft.com/office/drawing/2016/ink" xmlns:am3d="http://schemas.microsoft.com/office/drawing/2017/model3d" xmlns:o="urn:schemas-microsoft-com:office:office" xmlns:r="http://schemas.openxmlformats.org/officeDocument/2006/relationships" xmlns:m="http://schemas.openxmlformats.org/officeDocument/2006/math" xmlns:v="urn:schemas-microsoft-com:vml" xmlns:wp14="http://schemas.microsoft.com/office/word/2010/wordprocessingDrawing" xmlns:wp="http://schemas.openxmlformats.org/drawingml/2006/wordprocessingDrawing" xmlns:w10="urn:schemas-microsoft-com:office:word" xmlns:w="http://schemas.openxmlformats.org/wordprocessingml/2006/main" xmlns:w14="http://schemas.microsoft.com/office/word/2010/wordml" xmlns:w15="http://schemas.microsoft.com/office/word/2012/wordml" xmlns:w16cex="http://schemas.microsoft.com/office/word/2018/wordml/cex" xmlns:w16cid="http://schemas.microsoft.com/office/word/2016/wordml/cid" xmlns:w16="http://schemas.microsoft.com/office/word/2018/wordml" xmlns:w16sdtdh="http://schemas.microsoft.com/office/word/2020/wordml/sdtdatahash" xmlns:w16se="http://schemas.microsoft.com/office/word/2015/wordml/symex" xmlns:wpg="http://schemas.microsoft.com/office/word/2010/wordprocessingGroup" xmlns:wpi="http://schemas.microsoft.com/office/word/2010/wordprocessingInk" xmlns:wne="http://schemas.microsoft.com/office/word/2006/wordml" xmlns:wps="http://schemas.microsoft.com/office/word/2010/wordprocessingShape" mc:Ignorable="w14 w15 w16se w16cid w16 w16cex w16sdtdh wp14">
+<w:footnotes xmlns:wpc="http://schemas.microsoft.com/office/word/2010/wordprocessingCanvas" xmlns:cx="http://schemas.microsoft.com/office/drawing/2014/chartex" xmlns:cx1="http://schemas.microsoft.com/office/drawing/2015/9/8/chartex" xmlns:cx2="http://schemas.microsoft.com/office/drawing/2015/10/21/chartex" xmlns:cx3="http://schemas.microsoft.com/office/drawing/2016/5/9/chartex" xmlns:cx4="http://schemas.microsoft.com/office/drawing/2016/5/10/chartex" xmlns:cx5="http://schemas.microsoft.com/office/drawing/2016/5/11/chartex" xmlns:cx6="http://schemas.microsoft.com/office/drawing/2016/5/12/chartex" xmlns:cx7="http://schemas.microsoft.com/office/drawing/2016/5/13/chartex" xmlns:cx8="http://schemas.microsoft.com/office/drawing/2016/5/14/chartex" xmlns:mc="http://schemas.openxmlformats.org/markup-compatibility/2006" xmlns:aink="http://schemas.microsoft.com/office/drawing/2016/ink" xmlns:am3d="http://schemas.microsoft.com/office/drawing/2017/model3d" xmlns:o="urn:schemas-microsoft-com:office:office" xmlns:oel="http://schemas.microsoft.com/office/2019/extlst" xmlns:r="http://schemas.openxmlformats.org/officeDocument/2006/relationships" xmlns:m="http://schemas.openxmlformats.org/officeDocument/2006/math" xmlns:v="urn:schemas-microsoft-com:vml" xmlns:wp14="http://schemas.microsoft.com/office/word/2010/wordprocessingDrawing" xmlns:wp="http://schemas.openxmlformats.org/drawingml/2006/wordprocessingDrawing" xmlns:w10="urn:schemas-microsoft-com:office:word" xmlns:w="http://schemas.openxmlformats.org/wordprocessingml/2006/main" xmlns:w14="http://schemas.microsoft.com/office/word/2010/wordml" xmlns:w15="http://schemas.microsoft.com/office/word/2012/wordml" xmlns:w16cex="http://schemas.microsoft.com/office/word/2018/wordml/cex" xmlns:w16cid="http://schemas.microsoft.com/office/word/2016/wordml/cid" xmlns:w16="http://schemas.microsoft.com/office/word/2018/wordml" xmlns:w16du="http://schemas.microsoft.com/office/word/2023/wordml/word16du" xmlns:w16sdtdh="http://schemas.microsoft.com/office/word/2020/wordml/sdtdatahash" xmlns:w16sdtfl="http://schemas.microsoft.com/office/word/2024/wordml/sdtformatlock" xmlns:w16se="http://schemas.microsoft.com/office/word/2015/wordml/symex" xmlns:wpg="http://schemas.microsoft.com/office/word/2010/wordprocessingGroup" xmlns:wpi="http://schemas.microsoft.com/office/word/2010/wordprocessingInk" xmlns:wne="http://schemas.microsoft.com/office/word/2006/wordml" xmlns:wps="http://schemas.microsoft.com/office/word/2010/wordprocessingShape" mc:Ignorable="w14 w15 w16se w16cid w16 w16cex w16sdtdh w16sdtfl w16du wp14">
   <w:footnote w:type="separator" w:id="-1">
     <w:p>
       <w:pPr>
@@ -13754,7 +13325,7 @@
 </file>
 
 <file path=word/numbering.xml><?xml version="1.0" encoding="utf-8"?>
-<w:numbering xmlns:wpc="http://schemas.microsoft.com/office/word/2010/wordprocessingCanvas" xmlns:cx="http://schemas.microsoft.com/office/drawing/2014/chartex" xmlns:cx1="http://schemas.microsoft.com/office/drawing/2015/9/8/chartex" xmlns:cx2="http://schemas.microsoft.com/office/drawing/2015/10/21/chartex" xmlns:cx3="http://schemas.microsoft.com/office/drawing/2016/5/9/chartex" xmlns:cx4="http://schemas.microsoft.com/office/drawing/2016/5/10/chartex" xmlns:cx5="http://schemas.microsoft.com/office/drawing/2016/5/11/chartex" xmlns:cx6="http://schemas.microsoft.com/office/drawing/2016/5/12/chartex" xmlns:cx7="http://schemas.microsoft.com/office/drawing/2016/5/13/chartex" xmlns:cx8="http://schemas.microsoft.com/office/drawing/2016/5/14/chartex" xmlns:mc="http://schemas.openxmlformats.org/markup-compatibility/2006" xmlns:aink="http://schemas.microsoft.com/office/drawing/2016/ink" xmlns:am3d="http://schemas.microsoft.com/office/drawing/2017/model3d" xmlns:o="urn:schemas-microsoft-com:office:office" xmlns:r="http://schemas.openxmlformats.org/officeDocument/2006/relationships" xmlns:m="http://schemas.openxmlformats.org/officeDocument/2006/math" xmlns:v="urn:schemas-microsoft-com:vml" xmlns:wp14="http://schemas.microsoft.com/office/word/2010/wordprocessingDrawing" xmlns:wp="http://schemas.openxmlformats.org/drawingml/2006/wordprocessingDrawing" xmlns:w10="urn:schemas-microsoft-com:office:word" xmlns:w="http://schemas.openxmlformats.org/wordprocessingml/2006/main" xmlns:w14="http://schemas.microsoft.com/office/word/2010/wordml" xmlns:w15="http://schemas.microsoft.com/office/word/2012/wordml" xmlns:w16cex="http://schemas.microsoft.com/office/word/2018/wordml/cex" xmlns:w16cid="http://schemas.microsoft.com/office/word/2016/wordml/cid" xmlns:w16="http://schemas.microsoft.com/office/word/2018/wordml" xmlns:w16sdtdh="http://schemas.microsoft.com/office/word/2020/wordml/sdtdatahash" xmlns:w16se="http://schemas.microsoft.com/office/word/2015/wordml/symex" xmlns:wpg="http://schemas.microsoft.com/office/word/2010/wordprocessingGroup" xmlns:wpi="http://schemas.microsoft.com/office/word/2010/wordprocessingInk" xmlns:wne="http://schemas.microsoft.com/office/word/2006/wordml" xmlns:wps="http://schemas.microsoft.com/office/word/2010/wordprocessingShape" mc:Ignorable="w14 w15 w16se w16cid w16 w16cex w16sdtdh wp14">
+<w:numbering xmlns:wpc="http://schemas.microsoft.com/office/word/2010/wordprocessingCanvas" xmlns:cx="http://schemas.microsoft.com/office/drawing/2014/chartex" xmlns:cx1="http://schemas.microsoft.com/office/drawing/2015/9/8/chartex" xmlns:cx2="http://schemas.microsoft.com/office/drawing/2015/10/21/chartex" xmlns:cx3="http://schemas.microsoft.com/office/drawing/2016/5/9/chartex" xmlns:cx4="http://schemas.microsoft.com/office/drawing/2016/5/10/chartex" xmlns:cx5="http://schemas.microsoft.com/office/drawing/2016/5/11/chartex" xmlns:cx6="http://schemas.microsoft.com/office/drawing/2016/5/12/chartex" xmlns:cx7="http://schemas.microsoft.com/office/drawing/2016/5/13/chartex" xmlns:cx8="http://schemas.microsoft.com/office/drawing/2016/5/14/chartex" xmlns:mc="http://schemas.openxmlformats.org/markup-compatibility/2006" xmlns:aink="http://schemas.microsoft.com/office/drawing/2016/ink" xmlns:am3d="http://schemas.microsoft.com/office/drawing/2017/model3d" xmlns:o="urn:schemas-microsoft-com:office:office" xmlns:oel="http://schemas.microsoft.com/office/2019/extlst" xmlns:r="http://schemas.openxmlformats.org/officeDocument/2006/relationships" xmlns:m="http://schemas.openxmlformats.org/officeDocument/2006/math" xmlns:v="urn:schemas-microsoft-com:vml" xmlns:wp14="http://schemas.microsoft.com/office/word/2010/wordprocessingDrawing" xmlns:wp="http://schemas.openxmlformats.org/drawingml/2006/wordprocessingDrawing" xmlns:w10="urn:schemas-microsoft-com:office:word" xmlns:w="http://schemas.openxmlformats.org/wordprocessingml/2006/main" xmlns:w14="http://schemas.microsoft.com/office/word/2010/wordml" xmlns:w15="http://schemas.microsoft.com/office/word/2012/wordml" xmlns:w16cex="http://schemas.microsoft.com/office/word/2018/wordml/cex" xmlns:w16cid="http://schemas.microsoft.com/office/word/2016/wordml/cid" xmlns:w16="http://schemas.microsoft.com/office/word/2018/wordml" xmlns:w16du="http://schemas.microsoft.com/office/word/2023/wordml/word16du" xmlns:w16sdtdh="http://schemas.microsoft.com/office/word/2020/wordml/sdtdatahash" xmlns:w16sdtfl="http://schemas.microsoft.com/office/word/2024/wordml/sdtformatlock" xmlns:w16se="http://schemas.microsoft.com/office/word/2015/wordml/symex" xmlns:wpg="http://schemas.microsoft.com/office/word/2010/wordprocessingGroup" xmlns:wpi="http://schemas.microsoft.com/office/word/2010/wordprocessingInk" xmlns:wne="http://schemas.microsoft.com/office/word/2006/wordml" xmlns:wps="http://schemas.microsoft.com/office/word/2010/wordprocessingShape" mc:Ignorable="w14 w15 w16se w16cid w16 w16cex w16sdtdh w16sdtfl w16du wp14">
   <w:abstractNum w:abstractNumId="0" w15:restartNumberingAfterBreak="0">
     <w:nsid w:val="00C24109"/>
     <w:multiLevelType w:val="hybridMultilevel"/>
@@ -13933,17 +13504,17 @@
       </w:pPr>
     </w:lvl>
   </w:abstractNum>
-  <w:num w:numId="1">
+  <w:num w:numId="1" w16cid:durableId="229928439">
     <w:abstractNumId w:val="1"/>
   </w:num>
-  <w:num w:numId="2">
+  <w:num w:numId="2" w16cid:durableId="1167986842">
     <w:abstractNumId w:val="0"/>
   </w:num>
 </w:numbering>
 </file>
 
 <file path=word/styles.xml><?xml version="1.0" encoding="utf-8"?>
-<w:styles xmlns:mc="http://schemas.openxmlformats.org/markup-compatibility/2006" xmlns:r="http://schemas.openxmlformats.org/officeDocument/2006/relationships" xmlns:w="http://schemas.openxmlformats.org/wordprocessingml/2006/main" xmlns:w14="http://schemas.microsoft.com/office/word/2010/wordml" xmlns:w15="http://schemas.microsoft.com/office/word/2012/wordml" xmlns:w16cex="http://schemas.microsoft.com/office/word/2018/wordml/cex" xmlns:w16cid="http://schemas.microsoft.com/office/word/2016/wordml/cid" xmlns:w16="http://schemas.microsoft.com/office/word/2018/wordml" xmlns:w16sdtdh="http://schemas.microsoft.com/office/word/2020/wordml/sdtdatahash" xmlns:w16se="http://schemas.microsoft.com/office/word/2015/wordml/symex" mc:Ignorable="w14 w15 w16se w16cid w16 w16cex w16sdtdh">
+<w:styles xmlns:mc="http://schemas.openxmlformats.org/markup-compatibility/2006" xmlns:r="http://schemas.openxmlformats.org/officeDocument/2006/relationships" xmlns:w="http://schemas.openxmlformats.org/wordprocessingml/2006/main" xmlns:w14="http://schemas.microsoft.com/office/word/2010/wordml" xmlns:w15="http://schemas.microsoft.com/office/word/2012/wordml" xmlns:w16cex="http://schemas.microsoft.com/office/word/2018/wordml/cex" xmlns:w16cid="http://schemas.microsoft.com/office/word/2016/wordml/cid" xmlns:w16="http://schemas.microsoft.com/office/word/2018/wordml" xmlns:w16du="http://schemas.microsoft.com/office/word/2023/wordml/word16du" xmlns:w16sdtdh="http://schemas.microsoft.com/office/word/2020/wordml/sdtdatahash" xmlns:w16sdtfl="http://schemas.microsoft.com/office/word/2024/wordml/sdtformatlock" xmlns:w16se="http://schemas.microsoft.com/office/word/2015/wordml/symex" mc:Ignorable="w14 w15 w16se w16cid w16 w16cex w16sdtdh w16sdtfl w16du">
   <w:docDefaults>
     <w:rPrDefault>
       <w:rPr>
@@ -14888,6 +14459,7 @@
     </c:plotArea>
     <c:plotVisOnly val="1"/>
     <c:dispBlanksAs val="gap"/>
+    <c:showDLblsOverMax val="0"/>
     <c:extLst>
       <c:ext xmlns:c16r3="http://schemas.microsoft.com/office/drawing/2017/03/chart" uri="{56B9EC1D-385E-4148-901F-78D8002777C0}">
         <c16r3:dataDisplayOptions16>
@@ -14895,7 +14467,6 @@
         </c16r3:dataDisplayOptions16>
       </c:ext>
     </c:extLst>
-    <c:showDLblsOverMax val="0"/>
   </c:chart>
   <c:spPr>
     <a:solidFill>
@@ -15276,6 +14847,7 @@
     </c:plotArea>
     <c:plotVisOnly val="1"/>
     <c:dispBlanksAs val="gap"/>
+    <c:showDLblsOverMax val="0"/>
     <c:extLst>
       <c:ext xmlns:c16r3="http://schemas.microsoft.com/office/drawing/2017/03/chart" uri="{56B9EC1D-385E-4148-901F-78D8002777C0}">
         <c16r3:dataDisplayOptions16>
@@ -15283,7 +14855,6 @@
         </c16r3:dataDisplayOptions16>
       </c:ext>
     </c:extLst>
-    <c:showDLblsOverMax val="0"/>
   </c:chart>
   <c:spPr>
     <a:solidFill>

</xml_diff>